<commit_message>
Sprint 2 report: add third privacy incident (Innova Energie) for rubric
Co-Authored-By: Claude Fable 5.1 <noreply@anthropic.com>
Claude-Session: https://claude.ai/code/session_01G4Ddwh7uTVc2EA5q2vaUJ2
</commit_message>
<xml_diff>
--- a/datalab-sprint2/Datalab1_Sprint2_Rapport_Energiemarkt_Enexis.docx
+++ b/datalab-sprint2/Datalab1_Sprint2_Rapport_Energiemarkt_Enexis.docx
@@ -552,7 +552,7 @@
             <w:tab/>
           </w:r>
           <w:r>
-            <w:t>17</w:t>
+            <w:t>18</w:t>
           </w:r>
         </w:p>
         <w:p>
@@ -569,7 +569,7 @@
             <w:tab/>
           </w:r>
           <w:r>
-            <w:t>18</w:t>
+            <w:t>19</w:t>
           </w:r>
         </w:p>
         <w:p>
@@ -586,7 +586,7 @@
             <w:tab/>
           </w:r>
           <w:r>
-            <w:t>19</w:t>
+            <w:t>20</w:t>
           </w:r>
         </w:p>
         <w:p>
@@ -603,7 +603,7 @@
             <w:tab/>
           </w:r>
           <w:r>
-            <w:t>21</w:t>
+            <w:t>22</w:t>
           </w:r>
         </w:p>
         <w:p>
@@ -620,7 +620,7 @@
             <w:tab/>
           </w:r>
           <w:r>
-            <w:t>24</w:t>
+            <w:t>25</w:t>
           </w:r>
         </w:p>
         <w:p>
@@ -637,7 +637,7 @@
             <w:tab/>
           </w:r>
           <w:r>
-            <w:t>36</w:t>
+            <w:t>37</w:t>
           </w:r>
         </w:p>
         <w:p>
@@ -654,7 +654,7 @@
             <w:tab/>
           </w:r>
           <w:r>
-            <w:t>37</w:t>
+            <w:t>39</w:t>
           </w:r>
         </w:p>
         <w:p>
@@ -671,7 +671,7 @@
             <w:tab/>
           </w:r>
           <w:r>
-            <w:t>39</w:t>
+            <w:t>41</w:t>
           </w:r>
         </w:p>
         <w:p>
@@ -6183,7 +6183,7 @@
     </w:p>
     <w:p>
       <w:r>
-        <w:t xml:space="preserve">De doelstellingen komen uit het Klimaatakkoord (2019) en de Klimaatwet. In de Klimaatwet staat dat Nederland in 2030 55% minder broeikasgassen moet uitstoten dan in 1990 (oorspronkelijk 49%, in 2021 verhoogd) en in 2050 95% minder. Voor de gebouwde omgeving is dat vertaald naar concrete aantallen (Rijksoverheid, z.d.; RVO, 2022):</w:t>
+        <w:t xml:space="preserve">De doelstellingen komen uit het Klimaatakkoord uit 2019 en uit de Klimaatwet. In de Klimaatwet staat dat Nederland in 2030 55% minder broeikasgassen moet uitstoten dan in 1990 (oorspronkelijk 49%, in 2021 verhoogd) en in 2050 95% minder. Voor de gebouwde omgeving is dat vertaald naar concrete aantallen (Rijksoverheid, z.d.; RVO, 2022):</w:t>
       </w:r>
     </w:p>
     <w:p>
@@ -7701,7 +7701,7 @@
     </w:p>
     <w:p>
       <w:r>
-        <w:t xml:space="preserve">We hebben eerst gezocht naar privacy-incidenten bij Enexis zelf, met zoektermen als "Enexis datalek", "Enexis Autoriteit Persoonsgegevens" en "Enexis slimme meter gegevens gelekt". We vonden geen gepubliceerd datalek of boete. Enexis heeft wel een procedure voor de meldplicht datalekken en een privacyverklaring, en legt op zijn website uit welke slimme-metergegevens het uitleest en waarvoor (Enexis Groep, z.d.; Enexis Netbeheer, z.d.). Omdat we geen incident bij Enexis konden vinden, hebben we volgens de opdracht een andere organisatie in de Nederlandse energiesector gekozen: Eneco, één van de drie grootste leveranciers. Eneco had twee duidelijk gedocumenteerde incidenten.</w:t>
+        <w:t xml:space="preserve">We hebben eerst gezocht naar privacy-incidenten bij Enexis zelf, met zoektermen als "Enexis datalek", "Enexis Autoriteit Persoonsgegevens" en "Enexis slimme meter gegevens gelekt". We vonden geen gepubliceerd datalek of boete. Enexis heeft wel een procedure voor de meldplicht datalekken en een privacyverklaring, en legt op zijn website uit welke slimme-metergegevens het uitleest en waarvoor (Enexis Groep, z.d.; Enexis Netbeheer, z.d.). Omdat we geen incident bij Enexis konden vinden, hebben we volgens de opdracht andere organisaties in de Nederlandse energiesector gekozen. We beschrijven drie incidenten: twee bij Eneco, één van de drie grootste leveranciers, en één bij de kleinere leverancier Innova Energie. Samen laten ze drie verschillende oorzaken zien: een aanval van buitenaf, een lek bij een externe leverancier en een dader van binnenuit.</w:t>
       </w:r>
     </w:p>
     <w:p>
@@ -7742,15 +7742,15 @@
     </w:p>
     <w:p>
       <w:pPr>
-        <w:pStyle w:val="Heading2"/>
-      </w:pPr>
-      <w:r>
-        <w:t xml:space="preserve">5.4 Hoe de AVG op deze incidenten van toepassing is</w:t>
-      </w:r>
-    </w:p>
-    <w:p>
-      <w:r>
-        <w:t xml:space="preserve">De Algemene verordening gegevensbescherming (AVG; Verordening (EU) 2016/679) geldt voor iedere organisatie die persoonsgegevens van mensen in de EU verwerkt. Naam, adres, e-mailadres, bankrekeningnummer, klantnummer en energieverbruik zijn persoonsgegevens (artikel 4). Hieronder staat per artikel hoe de AVG op de twee incidenten van toepassing is.</w:t>
+        <w:pStyle w:val="Heading3"/>
+      </w:pPr>
+      <w:r>
+        <w:t xml:space="preserve">Incident 3: medewerker steelt klantgegevens bij Innova Energie (maart 2026)</w:t>
+      </w:r>
+    </w:p>
+    <w:p>
+      <w:r>
+        <w:t xml:space="preserve">Op 19 maart 2026 waarschuwde energieleverancier Innova Energie zijn klanten voor een datalek dat niet door hackers, maar door een eigen medewerker was veroorzaakt. De medewerker had klantgegevens uit de systemen gehaald: voor- en achternaam, geboortedatum, telefoonnummer, e-mailadres, adresgegevens, bankrekeningnummer en de naam van de rekeninghouder. Hoeveel klanten het betrof, maakte het bedrijf niet bekend. Innova Energie heeft de medewerker ontslagen, aangifte gedaan bij het Openbaar Ministerie, het lek gemeld bij de Autoriteit Persoonsgegevens en de beveiliging aangescherpt (Security.NL, 2026). Het gevolg voor klanten is groot: met naam, geboortedatum en bankrekeningnummer kunnen criminelen identiteitsfraude plegen of overtuigende phishing-berichten sturen. Dit incident laat zien dat de grootste bedreiging soms van binnenuit komt en dat ook de eigen medewerkers alleen toegang mogen hebben tot de gegevens die zij voor hun werk nodig hebben.</w:t>
       </w:r>
     </w:p>
     <w:tbl>
@@ -7766,10 +7766,10 @@
         </w:tblBorders>
       </w:tblPr>
       <w:tblGrid>
-        <w:gridCol w:w="2100"/>
-        <w:gridCol w:w="2500"/>
-        <w:gridCol w:w="2516"/>
-        <w:gridCol w:w="2516"/>
+        <w:gridCol w:w="1500"/>
+        <w:gridCol w:w="2710"/>
+        <w:gridCol w:w="2710"/>
+        <w:gridCol w:w="2712"/>
       </w:tblGrid>
       <w:tr>
         <w:trPr>
@@ -7777,7 +7777,25 @@
         </w:trPr>
         <w:tc>
           <w:tcPr>
-            <w:tcW w:type="dxa" w:w="2100"/>
+            <w:tcW w:type="dxa" w:w="1500"/>
+            <w:shd w:fill="D9EAF7" w:color="auto" w:val="clear"/>
+            <w:tcMar>
+              <w:top w:type="dxa" w:w="70"/>
+              <w:left w:type="dxa" w:w="100"/>
+              <w:bottom w:type="dxa" w:w="70"/>
+              <w:right w:type="dxa" w:w="100"/>
+            </w:tcMar>
+            <w:vAlign w:val="top"/>
+          </w:tcPr>
+          <w:p>
+            <w:pPr>
+              <w:spacing w:after="40"/>
+            </w:pPr>
+          </w:p>
+        </w:tc>
+        <w:tc>
+          <w:tcPr>
+            <w:tcW w:type="dxa" w:w="2710"/>
             <w:shd w:fill="D9EAF7" w:color="auto" w:val="clear"/>
             <w:tcMar>
               <w:top w:type="dxa" w:w="70"/>
@@ -7798,13 +7816,13 @@
                 <w:sz w:val="17"/>
                 <w:szCs w:val="17"/>
               </w:rPr>
-              <w:t xml:space="preserve">AVG-artikel</w:t>
-            </w:r>
-          </w:p>
-        </w:tc>
-        <w:tc>
-          <w:tcPr>
-            <w:tcW w:type="dxa" w:w="2500"/>
+              <w:t xml:space="preserve">Incident 1: Mijn Eneco (2021)</w:t>
+            </w:r>
+          </w:p>
+        </w:tc>
+        <w:tc>
+          <w:tcPr>
+            <w:tcW w:type="dxa" w:w="2710"/>
             <w:shd w:fill="D9EAF7" w:color="auto" w:val="clear"/>
             <w:tcMar>
               <w:top w:type="dxa" w:w="70"/>
@@ -7825,13 +7843,13 @@
                 <w:sz w:val="17"/>
                 <w:szCs w:val="17"/>
               </w:rPr>
-              <w:t xml:space="preserve">Wat het artikel eist</w:t>
-            </w:r>
-          </w:p>
-        </w:tc>
-        <w:tc>
-          <w:tcPr>
-            <w:tcW w:type="dxa" w:w="2516"/>
+              <w:t xml:space="preserve">Incident 2: AddComm (2024)</w:t>
+            </w:r>
+          </w:p>
+        </w:tc>
+        <w:tc>
+          <w:tcPr>
+            <w:tcW w:type="dxa" w:w="2712"/>
             <w:shd w:fill="D9EAF7" w:color="auto" w:val="clear"/>
             <w:tcMar>
               <w:top w:type="dxa" w:w="70"/>
@@ -7852,34 +7870,7 @@
                 <w:sz w:val="17"/>
                 <w:szCs w:val="17"/>
               </w:rPr>
-              <w:t xml:space="preserve">Incident 1: Mijn Eneco (2021)</w:t>
-            </w:r>
-          </w:p>
-        </w:tc>
-        <w:tc>
-          <w:tcPr>
-            <w:tcW w:type="dxa" w:w="2516"/>
-            <w:shd w:fill="D9EAF7" w:color="auto" w:val="clear"/>
-            <w:tcMar>
-              <w:top w:type="dxa" w:w="70"/>
-              <w:left w:type="dxa" w:w="100"/>
-              <w:bottom w:type="dxa" w:w="70"/>
-              <w:right w:type="dxa" w:w="100"/>
-            </w:tcMar>
-            <w:vAlign w:val="top"/>
-          </w:tcPr>
-          <w:p>
-            <w:pPr>
-              <w:spacing w:after="40"/>
-            </w:pPr>
-            <w:r>
-              <w:rPr>
-                <w:b/>
-                <w:bCs/>
-                <w:sz w:val="17"/>
-                <w:szCs w:val="17"/>
-              </w:rPr>
-              <w:t xml:space="preserve">Incident 2: AddComm (2024)</w:t>
+              <w:t xml:space="preserve">Incident 3: Innova Energie (2026)</w:t>
             </w:r>
           </w:p>
         </w:tc>
@@ -7890,7 +7881,7 @@
         </w:trPr>
         <w:tc>
           <w:tcPr>
-            <w:tcW w:type="dxa" w:w="2100"/>
+            <w:tcW w:type="dxa" w:w="1500"/>
             <w:tcMar>
               <w:top w:type="dxa" w:w="70"/>
               <w:left w:type="dxa" w:w="100"/>
@@ -7910,13 +7901,13 @@
                 <w:sz w:val="17"/>
                 <w:szCs w:val="17"/>
               </w:rPr>
-              <w:t xml:space="preserve">Art. 5: beginselen (integriteit en vertrouwelijkheid, dataminimalisatie)</w:t>
-            </w:r>
-          </w:p>
-        </w:tc>
-        <w:tc>
-          <w:tcPr>
-            <w:tcW w:type="dxa" w:w="2500"/>
+              <w:t xml:space="preserve">Oorzaak</w:t>
+            </w:r>
+          </w:p>
+        </w:tc>
+        <w:tc>
+          <w:tcPr>
+            <w:tcW w:type="dxa" w:w="2710"/>
             <w:tcMar>
               <w:top w:type="dxa" w:w="70"/>
               <w:left w:type="dxa" w:w="100"/>
@@ -7936,13 +7927,13 @@
                 <w:sz w:val="17"/>
                 <w:szCs w:val="17"/>
               </w:rPr>
-              <w:t xml:space="preserve">Gegevens moeten passend beveiligd zijn en er mogen niet meer gegevens worden verwerkt dan nodig.</w:t>
-            </w:r>
-          </w:p>
-        </w:tc>
-        <w:tc>
-          <w:tcPr>
-            <w:tcW w:type="dxa" w:w="2516"/>
+              <w:t xml:space="preserve">Credential stuffing: hergebruikte wachtwoorden uit lekken bij andere websites</w:t>
+            </w:r>
+          </w:p>
+        </w:tc>
+        <w:tc>
+          <w:tcPr>
+            <w:tcW w:type="dxa" w:w="2710"/>
             <w:tcMar>
               <w:top w:type="dxa" w:w="70"/>
               <w:left w:type="dxa" w:w="100"/>
@@ -7962,13 +7953,13 @@
                 <w:sz w:val="17"/>
                 <w:szCs w:val="17"/>
               </w:rPr>
-              <w:t xml:space="preserve">Bankrekeningnummers waren zichtbaar in een klantportaal dat alleen met wachtwoord was beveiligd.</w:t>
-            </w:r>
-          </w:p>
-        </w:tc>
-        <w:tc>
-          <w:tcPr>
-            <w:tcW w:type="dxa" w:w="2516"/>
+              <w:t xml:space="preserve">Ransomware-aanval op een externe verwerker die post en e-mail verstuurt</w:t>
+            </w:r>
+          </w:p>
+        </w:tc>
+        <w:tc>
+          <w:tcPr>
+            <w:tcW w:type="dxa" w:w="2712"/>
             <w:tcMar>
               <w:top w:type="dxa" w:w="70"/>
               <w:left w:type="dxa" w:w="100"/>
@@ -7988,7 +7979,7 @@
                 <w:sz w:val="17"/>
                 <w:szCs w:val="17"/>
               </w:rPr>
-              <w:t xml:space="preserve">Een externe partij had toegang tot grote hoeveelheden klantgegevens voor het versturen van post.</w:t>
+              <w:t xml:space="preserve">Een eigen medewerker haalde zonder toestemming klantgegevens uit de systemen</w:t>
             </w:r>
           </w:p>
         </w:tc>
@@ -7999,7 +7990,7 @@
         </w:trPr>
         <w:tc>
           <w:tcPr>
-            <w:tcW w:type="dxa" w:w="2100"/>
+            <w:tcW w:type="dxa" w:w="1500"/>
             <w:shd w:fill="F7FAFC" w:color="auto" w:val="clear"/>
             <w:tcMar>
               <w:top w:type="dxa" w:w="70"/>
@@ -8020,13 +8011,13 @@
                 <w:sz w:val="17"/>
                 <w:szCs w:val="17"/>
               </w:rPr>
-              <w:t xml:space="preserve">Art. 24 en 32: passende technische en organisatorische maatregelen</w:t>
-            </w:r>
-          </w:p>
-        </w:tc>
-        <w:tc>
-          <w:tcPr>
-            <w:tcW w:type="dxa" w:w="2500"/>
+              <w:t xml:space="preserve">Betrokkenen</w:t>
+            </w:r>
+          </w:p>
+        </w:tc>
+        <w:tc>
+          <w:tcPr>
+            <w:tcW w:type="dxa" w:w="2710"/>
             <w:shd w:fill="F7FAFC" w:color="auto" w:val="clear"/>
             <w:tcMar>
               <w:top w:type="dxa" w:w="70"/>
@@ -8047,13 +8038,13 @@
                 <w:sz w:val="17"/>
                 <w:szCs w:val="17"/>
               </w:rPr>
-              <w:t xml:space="preserve">Beveiliging moet passen bij het risico, bijvoorbeeld tweefactorauthenticatie, het blokkeren van verdachte inlogpogingen en versleuteling.</w:t>
-            </w:r>
-          </w:p>
-        </w:tc>
-        <w:tc>
-          <w:tcPr>
-            <w:tcW w:type="dxa" w:w="2516"/>
+              <w:t xml:space="preserve">1.700 particuliere en kleinzakelijke klanten; 47.000 klanten uit voorzorg gewaarschuwd</w:t>
+            </w:r>
+          </w:p>
+        </w:tc>
+        <w:tc>
+          <w:tcPr>
+            <w:tcW w:type="dxa" w:w="2710"/>
             <w:shd w:fill="F7FAFC" w:color="auto" w:val="clear"/>
             <w:tcMar>
               <w:top w:type="dxa" w:w="70"/>
@@ -8074,13 +8065,13 @@
                 <w:sz w:val="17"/>
                 <w:szCs w:val="17"/>
               </w:rPr>
-              <w:t xml:space="preserve">Credential stuffing is een bekend risico; de vraag is of Eneco voldoende maatregelen had (zoals het herkennen van duizenden inlogpogingen vanaf één bron).</w:t>
-            </w:r>
-          </w:p>
-        </w:tc>
-        <w:tc>
-          <w:tcPr>
-            <w:tcW w:type="dxa" w:w="2516"/>
+              <w:t xml:space="preserve">Klanten van Eneco, Essent, Vattenfall en tientallen andere organisaties</w:t>
+            </w:r>
+          </w:p>
+        </w:tc>
+        <w:tc>
+          <w:tcPr>
+            <w:tcW w:type="dxa" w:w="2712"/>
             <w:shd w:fill="F7FAFC" w:color="auto" w:val="clear"/>
             <w:tcMar>
               <w:top w:type="dxa" w:w="70"/>
@@ -8101,7 +8092,7 @@
                 <w:sz w:val="17"/>
                 <w:szCs w:val="17"/>
               </w:rPr>
-              <w:t xml:space="preserve">Eneco moet controleren of AddComm voldoende beveiligd was; ransomware is een bekend risico.</w:t>
+              <w:t xml:space="preserve">Onbekend aantal klanten van Innova Energie</w:t>
             </w:r>
           </w:p>
         </w:tc>
@@ -8112,7 +8103,7 @@
         </w:trPr>
         <w:tc>
           <w:tcPr>
-            <w:tcW w:type="dxa" w:w="2100"/>
+            <w:tcW w:type="dxa" w:w="1500"/>
             <w:tcMar>
               <w:top w:type="dxa" w:w="70"/>
               <w:left w:type="dxa" w:w="100"/>
@@ -8132,13 +8123,13 @@
                 <w:sz w:val="17"/>
                 <w:szCs w:val="17"/>
               </w:rPr>
-              <w:t xml:space="preserve">Art. 28: verwerker en verwerkersovereenkomst</w:t>
-            </w:r>
-          </w:p>
-        </w:tc>
-        <w:tc>
-          <w:tcPr>
-            <w:tcW w:type="dxa" w:w="2500"/>
+              <w:t xml:space="preserve">Gelekte gegevens</w:t>
+            </w:r>
+          </w:p>
+        </w:tc>
+        <w:tc>
+          <w:tcPr>
+            <w:tcW w:type="dxa" w:w="2710"/>
             <w:tcMar>
               <w:top w:type="dxa" w:w="70"/>
               <w:left w:type="dxa" w:w="100"/>
@@ -8158,13 +8149,13 @@
                 <w:sz w:val="17"/>
                 <w:szCs w:val="17"/>
               </w:rPr>
-              <w:t xml:space="preserve">Als een organisatie een ander bedrijf gegevens laat verwerken, blijft zij zelf verantwoordelijk en moet zij afspraken over beveiliging vastleggen.</w:t>
-            </w:r>
-          </w:p>
-        </w:tc>
-        <w:tc>
-          <w:tcPr>
-            <w:tcW w:type="dxa" w:w="2516"/>
+              <w:t xml:space="preserve">Naam, adres, bankrekeningnummer (in te zien en mogelijk aan te passen)</w:t>
+            </w:r>
+          </w:p>
+        </w:tc>
+        <w:tc>
+          <w:tcPr>
+            <w:tcW w:type="dxa" w:w="2710"/>
             <w:tcMar>
               <w:top w:type="dxa" w:w="70"/>
               <w:left w:type="dxa" w:w="100"/>
@@ -8184,13 +8175,13 @@
                 <w:sz w:val="17"/>
                 <w:szCs w:val="17"/>
               </w:rPr>
-              <w:t xml:space="preserve">Niet van toepassing: Eneco verwerkte zelf.</w:t>
-            </w:r>
-          </w:p>
-        </w:tc>
-        <w:tc>
-          <w:tcPr>
-            <w:tcW w:type="dxa" w:w="2516"/>
+              <w:t xml:space="preserve">Bij Eneco onduidelijk; elders naam, adres en klantnummer</w:t>
+            </w:r>
+          </w:p>
+        </w:tc>
+        <w:tc>
+          <w:tcPr>
+            <w:tcW w:type="dxa" w:w="2712"/>
             <w:tcMar>
               <w:top w:type="dxa" w:w="70"/>
               <w:left w:type="dxa" w:w="100"/>
@@ -8210,7 +8201,7 @@
                 <w:sz w:val="17"/>
                 <w:szCs w:val="17"/>
               </w:rPr>
-              <w:t xml:space="preserve">Direct van toepassing: AddComm is verwerker, Eneco (en Essent, Vattenfall) blijven verwerkingsverantwoordelijke.</w:t>
+              <w:t xml:space="preserve">Naam, geboortedatum, telefoon, e-mail, adres, bankrekeningnummer en tenaamstelling</w:t>
             </w:r>
           </w:p>
         </w:tc>
@@ -8221,7 +8212,7 @@
         </w:trPr>
         <w:tc>
           <w:tcPr>
-            <w:tcW w:type="dxa" w:w="2100"/>
+            <w:tcW w:type="dxa" w:w="1500"/>
             <w:shd w:fill="F7FAFC" w:color="auto" w:val="clear"/>
             <w:tcMar>
               <w:top w:type="dxa" w:w="70"/>
@@ -8242,13 +8233,13 @@
                 <w:sz w:val="17"/>
                 <w:szCs w:val="17"/>
               </w:rPr>
-              <w:t xml:space="preserve">Art. 33: melding bij de Autoriteit Persoonsgegevens binnen 72 uur</w:t>
-            </w:r>
-          </w:p>
-        </w:tc>
-        <w:tc>
-          <w:tcPr>
-            <w:tcW w:type="dxa" w:w="2500"/>
+              <w:t xml:space="preserve">Gevolgen</w:t>
+            </w:r>
+          </w:p>
+        </w:tc>
+        <w:tc>
+          <w:tcPr>
+            <w:tcW w:type="dxa" w:w="2710"/>
             <w:shd w:fill="F7FAFC" w:color="auto" w:val="clear"/>
             <w:tcMar>
               <w:top w:type="dxa" w:w="70"/>
@@ -8269,13 +8260,13 @@
                 <w:sz w:val="17"/>
                 <w:szCs w:val="17"/>
               </w:rPr>
-              <w:t xml:space="preserve">Een datalek met risico voor betrokkenen moet binnen 72 uur worden gemeld.</w:t>
-            </w:r>
-          </w:p>
-        </w:tc>
-        <w:tc>
-          <w:tcPr>
-            <w:tcW w:type="dxa" w:w="2516"/>
+              <w:t xml:space="preserve">Risico op fraude en phishing; portaal tijdelijk gesloten; wachtwoorden gereset</w:t>
+            </w:r>
+          </w:p>
+        </w:tc>
+        <w:tc>
+          <w:tcPr>
+            <w:tcW w:type="dxa" w:w="2710"/>
             <w:shd w:fill="F7FAFC" w:color="auto" w:val="clear"/>
             <w:tcMar>
               <w:top w:type="dxa" w:w="70"/>
@@ -8296,13 +8287,13 @@
                 <w:sz w:val="17"/>
                 <w:szCs w:val="17"/>
               </w:rPr>
-              <w:t xml:space="preserve">Eneco meldde het lek bij de AP en deed aangifte.</w:t>
-            </w:r>
-          </w:p>
-        </w:tc>
-        <w:tc>
-          <w:tcPr>
-            <w:tcW w:type="dxa" w:w="2516"/>
+              <w:t xml:space="preserve">Risico op gerichte phishing uit naam van Eneco</w:t>
+            </w:r>
+          </w:p>
+        </w:tc>
+        <w:tc>
+          <w:tcPr>
+            <w:tcW w:type="dxa" w:w="2712"/>
             <w:shd w:fill="F7FAFC" w:color="auto" w:val="clear"/>
             <w:tcMar>
               <w:top w:type="dxa" w:w="70"/>
@@ -8323,7 +8314,7 @@
                 <w:sz w:val="17"/>
                 <w:szCs w:val="17"/>
               </w:rPr>
-              <w:t xml:space="preserve">De getroffen organisaties meldden het lek; de verwerker moet de verantwoordelijke direct informeren (art. 33 lid 2).</w:t>
+              <w:t xml:space="preserve">Risico op identiteitsfraude en phishing; aangifte en ontslag medewerker</w:t>
             </w:r>
           </w:p>
         </w:tc>
@@ -8334,7 +8325,7 @@
         </w:trPr>
         <w:tc>
           <w:tcPr>
-            <w:tcW w:type="dxa" w:w="2100"/>
+            <w:tcW w:type="dxa" w:w="1500"/>
             <w:tcMar>
               <w:top w:type="dxa" w:w="70"/>
               <w:left w:type="dxa" w:w="100"/>
@@ -8354,13 +8345,13 @@
                 <w:sz w:val="17"/>
                 <w:szCs w:val="17"/>
               </w:rPr>
-              <w:t xml:space="preserve">Art. 34: informeren van betrokkenen</w:t>
-            </w:r>
-          </w:p>
-        </w:tc>
-        <w:tc>
-          <w:tcPr>
-            <w:tcW w:type="dxa" w:w="2500"/>
+              <w:t xml:space="preserve">Melding AP</w:t>
+            </w:r>
+          </w:p>
+        </w:tc>
+        <w:tc>
+          <w:tcPr>
+            <w:tcW w:type="dxa" w:w="2710"/>
             <w:tcMar>
               <w:top w:type="dxa" w:w="70"/>
               <w:left w:type="dxa" w:w="100"/>
@@ -8380,13 +8371,13 @@
                 <w:sz w:val="17"/>
                 <w:szCs w:val="17"/>
               </w:rPr>
-              <w:t xml:space="preserve">Bij een hoog risico moeten de betrokkenen zelf worden geïnformeerd.</w:t>
-            </w:r>
-          </w:p>
-        </w:tc>
-        <w:tc>
-          <w:tcPr>
-            <w:tcW w:type="dxa" w:w="2516"/>
+              <w:t xml:space="preserve">Ja, plus aangifte politie</w:t>
+            </w:r>
+          </w:p>
+        </w:tc>
+        <w:tc>
+          <w:tcPr>
+            <w:tcW w:type="dxa" w:w="2710"/>
             <w:tcMar>
               <w:top w:type="dxa" w:w="70"/>
               <w:left w:type="dxa" w:w="100"/>
@@ -8406,13 +8397,13 @@
                 <w:sz w:val="17"/>
                 <w:szCs w:val="17"/>
               </w:rPr>
-              <w:t xml:space="preserve">1.700 klanten geïnformeerd en 47.000 uit voorzorg gewaarschuwd.</w:t>
-            </w:r>
-          </w:p>
-        </w:tc>
-        <w:tc>
-          <w:tcPr>
-            <w:tcW w:type="dxa" w:w="2516"/>
+              <w:t xml:space="preserve">Ja, door de getroffen organisaties</w:t>
+            </w:r>
+          </w:p>
+        </w:tc>
+        <w:tc>
+          <w:tcPr>
+            <w:tcW w:type="dxa" w:w="2712"/>
             <w:tcMar>
               <w:top w:type="dxa" w:w="70"/>
               <w:left w:type="dxa" w:w="100"/>
@@ -8432,7 +8423,195 @@
                 <w:sz w:val="17"/>
                 <w:szCs w:val="17"/>
               </w:rPr>
-              <w:t xml:space="preserve">Klanten gewaarschuwd voor phishing en gevraagd om post te controleren.</w:t>
+              <w:t xml:space="preserve">Ja, plus aangifte bij het OM</w:t>
+            </w:r>
+          </w:p>
+        </w:tc>
+      </w:tr>
+    </w:tbl>
+    <w:p>
+      <w:pPr>
+        <w:spacing w:after="240" w:before="60"/>
+      </w:pPr>
+      <w:r>
+        <w:rPr>
+          <w:i/>
+          <w:iCs/>
+          <w:color w:val="595959"/>
+          <w:sz w:val="18"/>
+          <w:szCs w:val="18"/>
+        </w:rPr>
+        <w:t xml:space="preserve">Tabel 9. Overzicht van de drie privacy-incidenten: oorzaak, betrokkenen en gevolgen. Bronnen: NOS (2024); Security.NL (2021, 2024a, 2024b, 2026).</w:t>
+      </w:r>
+    </w:p>
+    <w:p>
+      <w:pPr>
+        <w:pStyle w:val="Heading2"/>
+      </w:pPr>
+      <w:r>
+        <w:t xml:space="preserve">5.4 Hoe de AVG op deze incidenten van toepassing is</w:t>
+      </w:r>
+    </w:p>
+    <w:p>
+      <w:r>
+        <w:t xml:space="preserve">De Algemene verordening gegevensbescherming (AVG; Verordening (EU) 2016/679) geldt voor iedere organisatie die persoonsgegevens van mensen in de EU verwerkt. Naam, adres, e-mailadres, bankrekeningnummer, klantnummer en energieverbruik zijn persoonsgegevens (artikel 4). Hieronder staat per artikel hoe de AVG op de drie incidenten van toepassing is.</w:t>
+      </w:r>
+    </w:p>
+    <w:tbl>
+      <w:tblPr>
+        <w:tblW w:type="dxa" w:w="9632"/>
+        <w:tblBorders>
+          <w:top w:val="single" w:color="D9D9D9" w:sz="4"/>
+          <w:left w:val="single" w:color="D9D9D9" w:sz="4"/>
+          <w:bottom w:val="single" w:color="D9D9D9" w:sz="4"/>
+          <w:right w:val="single" w:color="D9D9D9" w:sz="4"/>
+          <w:insideH w:val="single" w:color="D9D9D9" w:sz="4"/>
+          <w:insideV w:val="single" w:color="D9D9D9" w:sz="4"/>
+        </w:tblBorders>
+      </w:tblPr>
+      <w:tblGrid>
+        <w:gridCol w:w="1750"/>
+        <w:gridCol w:w="2000"/>
+        <w:gridCol w:w="1960"/>
+        <w:gridCol w:w="1960"/>
+        <w:gridCol w:w="1962"/>
+      </w:tblGrid>
+      <w:tr>
+        <w:trPr>
+          <w:tblHeader/>
+        </w:trPr>
+        <w:tc>
+          <w:tcPr>
+            <w:tcW w:type="dxa" w:w="1750"/>
+            <w:shd w:fill="D9EAF7" w:color="auto" w:val="clear"/>
+            <w:tcMar>
+              <w:top w:type="dxa" w:w="70"/>
+              <w:left w:type="dxa" w:w="100"/>
+              <w:bottom w:type="dxa" w:w="70"/>
+              <w:right w:type="dxa" w:w="100"/>
+            </w:tcMar>
+            <w:vAlign w:val="top"/>
+          </w:tcPr>
+          <w:p>
+            <w:pPr>
+              <w:spacing w:after="40"/>
+            </w:pPr>
+            <w:r>
+              <w:rPr>
+                <w:b/>
+                <w:bCs/>
+                <w:sz w:val="16"/>
+                <w:szCs w:val="16"/>
+              </w:rPr>
+              <w:t xml:space="preserve">AVG-artikel</w:t>
+            </w:r>
+          </w:p>
+        </w:tc>
+        <w:tc>
+          <w:tcPr>
+            <w:tcW w:type="dxa" w:w="2000"/>
+            <w:shd w:fill="D9EAF7" w:color="auto" w:val="clear"/>
+            <w:tcMar>
+              <w:top w:type="dxa" w:w="70"/>
+              <w:left w:type="dxa" w:w="100"/>
+              <w:bottom w:type="dxa" w:w="70"/>
+              <w:right w:type="dxa" w:w="100"/>
+            </w:tcMar>
+            <w:vAlign w:val="top"/>
+          </w:tcPr>
+          <w:p>
+            <w:pPr>
+              <w:spacing w:after="40"/>
+            </w:pPr>
+            <w:r>
+              <w:rPr>
+                <w:b/>
+                <w:bCs/>
+                <w:sz w:val="16"/>
+                <w:szCs w:val="16"/>
+              </w:rPr>
+              <w:t xml:space="preserve">Wat het artikel eist</w:t>
+            </w:r>
+          </w:p>
+        </w:tc>
+        <w:tc>
+          <w:tcPr>
+            <w:tcW w:type="dxa" w:w="1960"/>
+            <w:shd w:fill="D9EAF7" w:color="auto" w:val="clear"/>
+            <w:tcMar>
+              <w:top w:type="dxa" w:w="70"/>
+              <w:left w:type="dxa" w:w="100"/>
+              <w:bottom w:type="dxa" w:w="70"/>
+              <w:right w:type="dxa" w:w="100"/>
+            </w:tcMar>
+            <w:vAlign w:val="top"/>
+          </w:tcPr>
+          <w:p>
+            <w:pPr>
+              <w:spacing w:after="40"/>
+            </w:pPr>
+            <w:r>
+              <w:rPr>
+                <w:b/>
+                <w:bCs/>
+                <w:sz w:val="16"/>
+                <w:szCs w:val="16"/>
+              </w:rPr>
+              <w:t xml:space="preserve">Incident 1: Mijn Eneco (2021)</w:t>
+            </w:r>
+          </w:p>
+        </w:tc>
+        <w:tc>
+          <w:tcPr>
+            <w:tcW w:type="dxa" w:w="1960"/>
+            <w:shd w:fill="D9EAF7" w:color="auto" w:val="clear"/>
+            <w:tcMar>
+              <w:top w:type="dxa" w:w="70"/>
+              <w:left w:type="dxa" w:w="100"/>
+              <w:bottom w:type="dxa" w:w="70"/>
+              <w:right w:type="dxa" w:w="100"/>
+            </w:tcMar>
+            <w:vAlign w:val="top"/>
+          </w:tcPr>
+          <w:p>
+            <w:pPr>
+              <w:spacing w:after="40"/>
+            </w:pPr>
+            <w:r>
+              <w:rPr>
+                <w:b/>
+                <w:bCs/>
+                <w:sz w:val="16"/>
+                <w:szCs w:val="16"/>
+              </w:rPr>
+              <w:t xml:space="preserve">Incident 2: AddComm (2024)</w:t>
+            </w:r>
+          </w:p>
+        </w:tc>
+        <w:tc>
+          <w:tcPr>
+            <w:tcW w:type="dxa" w:w="1962"/>
+            <w:shd w:fill="D9EAF7" w:color="auto" w:val="clear"/>
+            <w:tcMar>
+              <w:top w:type="dxa" w:w="70"/>
+              <w:left w:type="dxa" w:w="100"/>
+              <w:bottom w:type="dxa" w:w="70"/>
+              <w:right w:type="dxa" w:w="100"/>
+            </w:tcMar>
+            <w:vAlign w:val="top"/>
+          </w:tcPr>
+          <w:p>
+            <w:pPr>
+              <w:spacing w:after="40"/>
+            </w:pPr>
+            <w:r>
+              <w:rPr>
+                <w:b/>
+                <w:bCs/>
+                <w:sz w:val="16"/>
+                <w:szCs w:val="16"/>
+              </w:rPr>
+              <w:t xml:space="preserve">Incident 3: Innova Energie (2026)</w:t>
             </w:r>
           </w:p>
         </w:tc>
@@ -8443,8 +8622,7 @@
         </w:trPr>
         <w:tc>
           <w:tcPr>
-            <w:tcW w:type="dxa" w:w="2100"/>
-            <w:shd w:fill="F7FAFC" w:color="auto" w:val="clear"/>
+            <w:tcW w:type="dxa" w:w="1750"/>
             <w:tcMar>
               <w:top w:type="dxa" w:w="70"/>
               <w:left w:type="dxa" w:w="100"/>
@@ -8461,8 +8639,694 @@
               <w:rPr>
                 <w:b/>
                 <w:bCs/>
-                <w:sz w:val="17"/>
-                <w:szCs w:val="17"/>
+                <w:sz w:val="16"/>
+                <w:szCs w:val="16"/>
+              </w:rPr>
+              <w:t xml:space="preserve">Art. 5: beginselen (integriteit en vertrouwelijkheid, dataminimalisatie)</w:t>
+            </w:r>
+          </w:p>
+        </w:tc>
+        <w:tc>
+          <w:tcPr>
+            <w:tcW w:type="dxa" w:w="2000"/>
+            <w:tcMar>
+              <w:top w:type="dxa" w:w="70"/>
+              <w:left w:type="dxa" w:w="100"/>
+              <w:bottom w:type="dxa" w:w="70"/>
+              <w:right w:type="dxa" w:w="100"/>
+            </w:tcMar>
+            <w:vAlign w:val="top"/>
+          </w:tcPr>
+          <w:p>
+            <w:pPr>
+              <w:spacing w:after="40"/>
+            </w:pPr>
+            <w:r>
+              <w:rPr>
+                <w:b w:val="false"/>
+                <w:bCs w:val="false"/>
+                <w:sz w:val="16"/>
+                <w:szCs w:val="16"/>
+              </w:rPr>
+              <w:t xml:space="preserve">Gegevens moeten passend beveiligd zijn en er mogen niet meer gegevens worden verwerkt dan nodig.</w:t>
+            </w:r>
+          </w:p>
+        </w:tc>
+        <w:tc>
+          <w:tcPr>
+            <w:tcW w:type="dxa" w:w="1960"/>
+            <w:tcMar>
+              <w:top w:type="dxa" w:w="70"/>
+              <w:left w:type="dxa" w:w="100"/>
+              <w:bottom w:type="dxa" w:w="70"/>
+              <w:right w:type="dxa" w:w="100"/>
+            </w:tcMar>
+            <w:vAlign w:val="top"/>
+          </w:tcPr>
+          <w:p>
+            <w:pPr>
+              <w:spacing w:after="40"/>
+            </w:pPr>
+            <w:r>
+              <w:rPr>
+                <w:b w:val="false"/>
+                <w:bCs w:val="false"/>
+                <w:sz w:val="16"/>
+                <w:szCs w:val="16"/>
+              </w:rPr>
+              <w:t xml:space="preserve">Bankrekeningnummers waren zichtbaar in een klantportaal dat alleen met een wachtwoord was beveiligd.</w:t>
+            </w:r>
+          </w:p>
+        </w:tc>
+        <w:tc>
+          <w:tcPr>
+            <w:tcW w:type="dxa" w:w="1960"/>
+            <w:tcMar>
+              <w:top w:type="dxa" w:w="70"/>
+              <w:left w:type="dxa" w:w="100"/>
+              <w:bottom w:type="dxa" w:w="70"/>
+              <w:right w:type="dxa" w:w="100"/>
+            </w:tcMar>
+            <w:vAlign w:val="top"/>
+          </w:tcPr>
+          <w:p>
+            <w:pPr>
+              <w:spacing w:after="40"/>
+            </w:pPr>
+            <w:r>
+              <w:rPr>
+                <w:b w:val="false"/>
+                <w:bCs w:val="false"/>
+                <w:sz w:val="16"/>
+                <w:szCs w:val="16"/>
+              </w:rPr>
+              <w:t xml:space="preserve">Een externe partij had toegang tot grote hoeveelheden klantgegevens voor het versturen van post.</w:t>
+            </w:r>
+          </w:p>
+        </w:tc>
+        <w:tc>
+          <w:tcPr>
+            <w:tcW w:type="dxa" w:w="1962"/>
+            <w:tcMar>
+              <w:top w:type="dxa" w:w="70"/>
+              <w:left w:type="dxa" w:w="100"/>
+              <w:bottom w:type="dxa" w:w="70"/>
+              <w:right w:type="dxa" w:w="100"/>
+            </w:tcMar>
+            <w:vAlign w:val="top"/>
+          </w:tcPr>
+          <w:p>
+            <w:pPr>
+              <w:spacing w:after="40"/>
+            </w:pPr>
+            <w:r>
+              <w:rPr>
+                <w:b w:val="false"/>
+                <w:bCs w:val="false"/>
+                <w:sz w:val="16"/>
+                <w:szCs w:val="16"/>
+              </w:rPr>
+              <w:t xml:space="preserve">Een medewerker kon een complete set gevoelige gegevens (incl. geboortedatum en IBAN) kopiëren.</w:t>
+            </w:r>
+          </w:p>
+        </w:tc>
+      </w:tr>
+      <w:tr>
+        <w:trPr>
+          <w:cantSplit/>
+        </w:trPr>
+        <w:tc>
+          <w:tcPr>
+            <w:tcW w:type="dxa" w:w="1750"/>
+            <w:shd w:fill="F7FAFC" w:color="auto" w:val="clear"/>
+            <w:tcMar>
+              <w:top w:type="dxa" w:w="70"/>
+              <w:left w:type="dxa" w:w="100"/>
+              <w:bottom w:type="dxa" w:w="70"/>
+              <w:right w:type="dxa" w:w="100"/>
+            </w:tcMar>
+            <w:vAlign w:val="top"/>
+          </w:tcPr>
+          <w:p>
+            <w:pPr>
+              <w:spacing w:after="40"/>
+            </w:pPr>
+            <w:r>
+              <w:rPr>
+                <w:b/>
+                <w:bCs/>
+                <w:sz w:val="16"/>
+                <w:szCs w:val="16"/>
+              </w:rPr>
+              <w:t xml:space="preserve">Art. 24 en 32: passende technische en organisatorische maatregelen</w:t>
+            </w:r>
+          </w:p>
+        </w:tc>
+        <w:tc>
+          <w:tcPr>
+            <w:tcW w:type="dxa" w:w="2000"/>
+            <w:shd w:fill="F7FAFC" w:color="auto" w:val="clear"/>
+            <w:tcMar>
+              <w:top w:type="dxa" w:w="70"/>
+              <w:left w:type="dxa" w:w="100"/>
+              <w:bottom w:type="dxa" w:w="70"/>
+              <w:right w:type="dxa" w:w="100"/>
+            </w:tcMar>
+            <w:vAlign w:val="top"/>
+          </w:tcPr>
+          <w:p>
+            <w:pPr>
+              <w:spacing w:after="40"/>
+            </w:pPr>
+            <w:r>
+              <w:rPr>
+                <w:b w:val="false"/>
+                <w:bCs w:val="false"/>
+                <w:sz w:val="16"/>
+                <w:szCs w:val="16"/>
+              </w:rPr>
+              <w:t xml:space="preserve">Beveiliging moet passen bij het risico: tweefactorauthenticatie, blokkeren van verdachte inlogpogingen, versleuteling, toegangsrechten en logging.</w:t>
+            </w:r>
+          </w:p>
+        </w:tc>
+        <w:tc>
+          <w:tcPr>
+            <w:tcW w:type="dxa" w:w="1960"/>
+            <w:shd w:fill="F7FAFC" w:color="auto" w:val="clear"/>
+            <w:tcMar>
+              <w:top w:type="dxa" w:w="70"/>
+              <w:left w:type="dxa" w:w="100"/>
+              <w:bottom w:type="dxa" w:w="70"/>
+              <w:right w:type="dxa" w:w="100"/>
+            </w:tcMar>
+            <w:vAlign w:val="top"/>
+          </w:tcPr>
+          <w:p>
+            <w:pPr>
+              <w:spacing w:after="40"/>
+            </w:pPr>
+            <w:r>
+              <w:rPr>
+                <w:b w:val="false"/>
+                <w:bCs w:val="false"/>
+                <w:sz w:val="16"/>
+                <w:szCs w:val="16"/>
+              </w:rPr>
+              <w:t xml:space="preserve">Credential stuffing is een bekend risico; de vraag is of Eneco voldoende maatregelen had, zoals het herkennen van duizenden inlogpogingen vanaf één bron.</w:t>
+            </w:r>
+          </w:p>
+        </w:tc>
+        <w:tc>
+          <w:tcPr>
+            <w:tcW w:type="dxa" w:w="1960"/>
+            <w:shd w:fill="F7FAFC" w:color="auto" w:val="clear"/>
+            <w:tcMar>
+              <w:top w:type="dxa" w:w="70"/>
+              <w:left w:type="dxa" w:w="100"/>
+              <w:bottom w:type="dxa" w:w="70"/>
+              <w:right w:type="dxa" w:w="100"/>
+            </w:tcMar>
+            <w:vAlign w:val="top"/>
+          </w:tcPr>
+          <w:p>
+            <w:pPr>
+              <w:spacing w:after="40"/>
+            </w:pPr>
+            <w:r>
+              <w:rPr>
+                <w:b w:val="false"/>
+                <w:bCs w:val="false"/>
+                <w:sz w:val="16"/>
+                <w:szCs w:val="16"/>
+              </w:rPr>
+              <w:t xml:space="preserve">Eneco moet controleren of AddComm voldoende beveiligd was; ransomware is een bekend risico.</w:t>
+            </w:r>
+          </w:p>
+        </w:tc>
+        <w:tc>
+          <w:tcPr>
+            <w:tcW w:type="dxa" w:w="1962"/>
+            <w:shd w:fill="F7FAFC" w:color="auto" w:val="clear"/>
+            <w:tcMar>
+              <w:top w:type="dxa" w:w="70"/>
+              <w:left w:type="dxa" w:w="100"/>
+              <w:bottom w:type="dxa" w:w="70"/>
+              <w:right w:type="dxa" w:w="100"/>
+            </w:tcMar>
+            <w:vAlign w:val="top"/>
+          </w:tcPr>
+          <w:p>
+            <w:pPr>
+              <w:spacing w:after="40"/>
+            </w:pPr>
+            <w:r>
+              <w:rPr>
+                <w:b w:val="false"/>
+                <w:bCs w:val="false"/>
+                <w:sz w:val="16"/>
+                <w:szCs w:val="16"/>
+              </w:rPr>
+              <w:t xml:space="preserve">Organisatorische maatregelen schoten tekort: toegang beperken tot wat een medewerker nodig heeft en downloads loggen en controleren.</w:t>
+            </w:r>
+          </w:p>
+        </w:tc>
+      </w:tr>
+      <w:tr>
+        <w:trPr>
+          <w:cantSplit/>
+        </w:trPr>
+        <w:tc>
+          <w:tcPr>
+            <w:tcW w:type="dxa" w:w="1750"/>
+            <w:tcMar>
+              <w:top w:type="dxa" w:w="70"/>
+              <w:left w:type="dxa" w:w="100"/>
+              <w:bottom w:type="dxa" w:w="70"/>
+              <w:right w:type="dxa" w:w="100"/>
+            </w:tcMar>
+            <w:vAlign w:val="top"/>
+          </w:tcPr>
+          <w:p>
+            <w:pPr>
+              <w:spacing w:after="40"/>
+            </w:pPr>
+            <w:r>
+              <w:rPr>
+                <w:b/>
+                <w:bCs/>
+                <w:sz w:val="16"/>
+                <w:szCs w:val="16"/>
+              </w:rPr>
+              <w:t xml:space="preserve">Art. 28 en 29: verwerker en verwerking onder gezag</w:t>
+            </w:r>
+          </w:p>
+        </w:tc>
+        <w:tc>
+          <w:tcPr>
+            <w:tcW w:type="dxa" w:w="2000"/>
+            <w:tcMar>
+              <w:top w:type="dxa" w:w="70"/>
+              <w:left w:type="dxa" w:w="100"/>
+              <w:bottom w:type="dxa" w:w="70"/>
+              <w:right w:type="dxa" w:w="100"/>
+            </w:tcMar>
+            <w:vAlign w:val="top"/>
+          </w:tcPr>
+          <w:p>
+            <w:pPr>
+              <w:spacing w:after="40"/>
+            </w:pPr>
+            <w:r>
+              <w:rPr>
+                <w:b w:val="false"/>
+                <w:bCs w:val="false"/>
+                <w:sz w:val="16"/>
+                <w:szCs w:val="16"/>
+              </w:rPr>
+              <w:t xml:space="preserve">Een ander bedrijf dat gegevens verwerkt is een verwerker (art. 28); medewerkers mogen alleen verwerken in opdracht van de werkgever (art. 29).</w:t>
+            </w:r>
+          </w:p>
+        </w:tc>
+        <w:tc>
+          <w:tcPr>
+            <w:tcW w:type="dxa" w:w="1960"/>
+            <w:tcMar>
+              <w:top w:type="dxa" w:w="70"/>
+              <w:left w:type="dxa" w:w="100"/>
+              <w:bottom w:type="dxa" w:w="70"/>
+              <w:right w:type="dxa" w:w="100"/>
+            </w:tcMar>
+            <w:vAlign w:val="top"/>
+          </w:tcPr>
+          <w:p>
+            <w:pPr>
+              <w:spacing w:after="40"/>
+            </w:pPr>
+            <w:r>
+              <w:rPr>
+                <w:b w:val="false"/>
+                <w:bCs w:val="false"/>
+                <w:sz w:val="16"/>
+                <w:szCs w:val="16"/>
+              </w:rPr>
+              <w:t xml:space="preserve">Niet van toepassing: Eneco verwerkte zelf.</w:t>
+            </w:r>
+          </w:p>
+        </w:tc>
+        <w:tc>
+          <w:tcPr>
+            <w:tcW w:type="dxa" w:w="1960"/>
+            <w:tcMar>
+              <w:top w:type="dxa" w:w="70"/>
+              <w:left w:type="dxa" w:w="100"/>
+              <w:bottom w:type="dxa" w:w="70"/>
+              <w:right w:type="dxa" w:w="100"/>
+            </w:tcMar>
+            <w:vAlign w:val="top"/>
+          </w:tcPr>
+          <w:p>
+            <w:pPr>
+              <w:spacing w:after="40"/>
+            </w:pPr>
+            <w:r>
+              <w:rPr>
+                <w:b w:val="false"/>
+                <w:bCs w:val="false"/>
+                <w:sz w:val="16"/>
+                <w:szCs w:val="16"/>
+              </w:rPr>
+              <w:t xml:space="preserve">Art. 28 direct van toepassing: AddComm is verwerker; Eneco, Essent en Vattenfall blijven verwerkingsverantwoordelijke.</w:t>
+            </w:r>
+          </w:p>
+        </w:tc>
+        <w:tc>
+          <w:tcPr>
+            <w:tcW w:type="dxa" w:w="1962"/>
+            <w:tcMar>
+              <w:top w:type="dxa" w:w="70"/>
+              <w:left w:type="dxa" w:w="100"/>
+              <w:bottom w:type="dxa" w:w="70"/>
+              <w:right w:type="dxa" w:w="100"/>
+            </w:tcMar>
+            <w:vAlign w:val="top"/>
+          </w:tcPr>
+          <w:p>
+            <w:pPr>
+              <w:spacing w:after="40"/>
+            </w:pPr>
+            <w:r>
+              <w:rPr>
+                <w:b w:val="false"/>
+                <w:bCs w:val="false"/>
+                <w:sz w:val="16"/>
+                <w:szCs w:val="16"/>
+              </w:rPr>
+              <w:t xml:space="preserve">Art. 29 overtreden: de medewerker verwerkte gegevens buiten de instructies van de werkgever om; Innova blijft verantwoordelijk.</w:t>
+            </w:r>
+          </w:p>
+        </w:tc>
+      </w:tr>
+      <w:tr>
+        <w:trPr>
+          <w:cantSplit/>
+        </w:trPr>
+        <w:tc>
+          <w:tcPr>
+            <w:tcW w:type="dxa" w:w="1750"/>
+            <w:shd w:fill="F7FAFC" w:color="auto" w:val="clear"/>
+            <w:tcMar>
+              <w:top w:type="dxa" w:w="70"/>
+              <w:left w:type="dxa" w:w="100"/>
+              <w:bottom w:type="dxa" w:w="70"/>
+              <w:right w:type="dxa" w:w="100"/>
+            </w:tcMar>
+            <w:vAlign w:val="top"/>
+          </w:tcPr>
+          <w:p>
+            <w:pPr>
+              <w:spacing w:after="40"/>
+            </w:pPr>
+            <w:r>
+              <w:rPr>
+                <w:b/>
+                <w:bCs/>
+                <w:sz w:val="16"/>
+                <w:szCs w:val="16"/>
+              </w:rPr>
+              <w:t xml:space="preserve">Art. 33: melding bij de Autoriteit Persoonsgegevens binnen 72 uur</w:t>
+            </w:r>
+          </w:p>
+        </w:tc>
+        <w:tc>
+          <w:tcPr>
+            <w:tcW w:type="dxa" w:w="2000"/>
+            <w:shd w:fill="F7FAFC" w:color="auto" w:val="clear"/>
+            <w:tcMar>
+              <w:top w:type="dxa" w:w="70"/>
+              <w:left w:type="dxa" w:w="100"/>
+              <w:bottom w:type="dxa" w:w="70"/>
+              <w:right w:type="dxa" w:w="100"/>
+            </w:tcMar>
+            <w:vAlign w:val="top"/>
+          </w:tcPr>
+          <w:p>
+            <w:pPr>
+              <w:spacing w:after="40"/>
+            </w:pPr>
+            <w:r>
+              <w:rPr>
+                <w:b w:val="false"/>
+                <w:bCs w:val="false"/>
+                <w:sz w:val="16"/>
+                <w:szCs w:val="16"/>
+              </w:rPr>
+              <w:t xml:space="preserve">Een datalek met risico voor betrokkenen moet binnen 72 uur worden gemeld.</w:t>
+            </w:r>
+          </w:p>
+        </w:tc>
+        <w:tc>
+          <w:tcPr>
+            <w:tcW w:type="dxa" w:w="1960"/>
+            <w:shd w:fill="F7FAFC" w:color="auto" w:val="clear"/>
+            <w:tcMar>
+              <w:top w:type="dxa" w:w="70"/>
+              <w:left w:type="dxa" w:w="100"/>
+              <w:bottom w:type="dxa" w:w="70"/>
+              <w:right w:type="dxa" w:w="100"/>
+            </w:tcMar>
+            <w:vAlign w:val="top"/>
+          </w:tcPr>
+          <w:p>
+            <w:pPr>
+              <w:spacing w:after="40"/>
+            </w:pPr>
+            <w:r>
+              <w:rPr>
+                <w:b w:val="false"/>
+                <w:bCs w:val="false"/>
+                <w:sz w:val="16"/>
+                <w:szCs w:val="16"/>
+              </w:rPr>
+              <w:t xml:space="preserve">Eneco meldde het lek bij de AP en deed aangifte.</w:t>
+            </w:r>
+          </w:p>
+        </w:tc>
+        <w:tc>
+          <w:tcPr>
+            <w:tcW w:type="dxa" w:w="1960"/>
+            <w:shd w:fill="F7FAFC" w:color="auto" w:val="clear"/>
+            <w:tcMar>
+              <w:top w:type="dxa" w:w="70"/>
+              <w:left w:type="dxa" w:w="100"/>
+              <w:bottom w:type="dxa" w:w="70"/>
+              <w:right w:type="dxa" w:w="100"/>
+            </w:tcMar>
+            <w:vAlign w:val="top"/>
+          </w:tcPr>
+          <w:p>
+            <w:pPr>
+              <w:spacing w:after="40"/>
+            </w:pPr>
+            <w:r>
+              <w:rPr>
+                <w:b w:val="false"/>
+                <w:bCs w:val="false"/>
+                <w:sz w:val="16"/>
+                <w:szCs w:val="16"/>
+              </w:rPr>
+              <w:t xml:space="preserve">De getroffen organisaties meldden het lek; de verwerker moet de verantwoordelijke direct informeren (art. 33 lid 2).</w:t>
+            </w:r>
+          </w:p>
+        </w:tc>
+        <w:tc>
+          <w:tcPr>
+            <w:tcW w:type="dxa" w:w="1962"/>
+            <w:shd w:fill="F7FAFC" w:color="auto" w:val="clear"/>
+            <w:tcMar>
+              <w:top w:type="dxa" w:w="70"/>
+              <w:left w:type="dxa" w:w="100"/>
+              <w:bottom w:type="dxa" w:w="70"/>
+              <w:right w:type="dxa" w:w="100"/>
+            </w:tcMar>
+            <w:vAlign w:val="top"/>
+          </w:tcPr>
+          <w:p>
+            <w:pPr>
+              <w:spacing w:after="40"/>
+            </w:pPr>
+            <w:r>
+              <w:rPr>
+                <w:b w:val="false"/>
+                <w:bCs w:val="false"/>
+                <w:sz w:val="16"/>
+                <w:szCs w:val="16"/>
+              </w:rPr>
+              <w:t xml:space="preserve">Innova Energie meldde het lek bij de AP en deed aangifte bij het OM.</w:t>
+            </w:r>
+          </w:p>
+        </w:tc>
+      </w:tr>
+      <w:tr>
+        <w:trPr>
+          <w:cantSplit/>
+        </w:trPr>
+        <w:tc>
+          <w:tcPr>
+            <w:tcW w:type="dxa" w:w="1750"/>
+            <w:tcMar>
+              <w:top w:type="dxa" w:w="70"/>
+              <w:left w:type="dxa" w:w="100"/>
+              <w:bottom w:type="dxa" w:w="70"/>
+              <w:right w:type="dxa" w:w="100"/>
+            </w:tcMar>
+            <w:vAlign w:val="top"/>
+          </w:tcPr>
+          <w:p>
+            <w:pPr>
+              <w:spacing w:after="40"/>
+            </w:pPr>
+            <w:r>
+              <w:rPr>
+                <w:b/>
+                <w:bCs/>
+                <w:sz w:val="16"/>
+                <w:szCs w:val="16"/>
+              </w:rPr>
+              <w:t xml:space="preserve">Art. 34: informeren van betrokkenen</w:t>
+            </w:r>
+          </w:p>
+        </w:tc>
+        <w:tc>
+          <w:tcPr>
+            <w:tcW w:type="dxa" w:w="2000"/>
+            <w:tcMar>
+              <w:top w:type="dxa" w:w="70"/>
+              <w:left w:type="dxa" w:w="100"/>
+              <w:bottom w:type="dxa" w:w="70"/>
+              <w:right w:type="dxa" w:w="100"/>
+            </w:tcMar>
+            <w:vAlign w:val="top"/>
+          </w:tcPr>
+          <w:p>
+            <w:pPr>
+              <w:spacing w:after="40"/>
+            </w:pPr>
+            <w:r>
+              <w:rPr>
+                <w:b w:val="false"/>
+                <w:bCs w:val="false"/>
+                <w:sz w:val="16"/>
+                <w:szCs w:val="16"/>
+              </w:rPr>
+              <w:t xml:space="preserve">Bij een hoog risico moeten de betrokkenen zelf worden geïnformeerd.</w:t>
+            </w:r>
+          </w:p>
+        </w:tc>
+        <w:tc>
+          <w:tcPr>
+            <w:tcW w:type="dxa" w:w="1960"/>
+            <w:tcMar>
+              <w:top w:type="dxa" w:w="70"/>
+              <w:left w:type="dxa" w:w="100"/>
+              <w:bottom w:type="dxa" w:w="70"/>
+              <w:right w:type="dxa" w:w="100"/>
+            </w:tcMar>
+            <w:vAlign w:val="top"/>
+          </w:tcPr>
+          <w:p>
+            <w:pPr>
+              <w:spacing w:after="40"/>
+            </w:pPr>
+            <w:r>
+              <w:rPr>
+                <w:b w:val="false"/>
+                <w:bCs w:val="false"/>
+                <w:sz w:val="16"/>
+                <w:szCs w:val="16"/>
+              </w:rPr>
+              <w:t xml:space="preserve">1.700 klanten geïnformeerd en 47.000 uit voorzorg gewaarschuwd.</w:t>
+            </w:r>
+          </w:p>
+        </w:tc>
+        <w:tc>
+          <w:tcPr>
+            <w:tcW w:type="dxa" w:w="1960"/>
+            <w:tcMar>
+              <w:top w:type="dxa" w:w="70"/>
+              <w:left w:type="dxa" w:w="100"/>
+              <w:bottom w:type="dxa" w:w="70"/>
+              <w:right w:type="dxa" w:w="100"/>
+            </w:tcMar>
+            <w:vAlign w:val="top"/>
+          </w:tcPr>
+          <w:p>
+            <w:pPr>
+              <w:spacing w:after="40"/>
+            </w:pPr>
+            <w:r>
+              <w:rPr>
+                <w:b w:val="false"/>
+                <w:bCs w:val="false"/>
+                <w:sz w:val="16"/>
+                <w:szCs w:val="16"/>
+              </w:rPr>
+              <w:t xml:space="preserve">Klanten gewaarschuwd voor phishing en gevraagd om post te controleren.</w:t>
+            </w:r>
+          </w:p>
+        </w:tc>
+        <w:tc>
+          <w:tcPr>
+            <w:tcW w:type="dxa" w:w="1962"/>
+            <w:tcMar>
+              <w:top w:type="dxa" w:w="70"/>
+              <w:left w:type="dxa" w:w="100"/>
+              <w:bottom w:type="dxa" w:w="70"/>
+              <w:right w:type="dxa" w:w="100"/>
+            </w:tcMar>
+            <w:vAlign w:val="top"/>
+          </w:tcPr>
+          <w:p>
+            <w:pPr>
+              <w:spacing w:after="40"/>
+            </w:pPr>
+            <w:r>
+              <w:rPr>
+                <w:b w:val="false"/>
+                <w:bCs w:val="false"/>
+                <w:sz w:val="16"/>
+                <w:szCs w:val="16"/>
+              </w:rPr>
+              <w:t xml:space="preserve">Klanten per brief/e-mail gewaarschuwd; door de combinatie van gegevens is het risico hoog, dus informeren was verplicht.</w:t>
+            </w:r>
+          </w:p>
+        </w:tc>
+      </w:tr>
+      <w:tr>
+        <w:trPr>
+          <w:cantSplit/>
+        </w:trPr>
+        <w:tc>
+          <w:tcPr>
+            <w:tcW w:type="dxa" w:w="1750"/>
+            <w:shd w:fill="F7FAFC" w:color="auto" w:val="clear"/>
+            <w:tcMar>
+              <w:top w:type="dxa" w:w="70"/>
+              <w:left w:type="dxa" w:w="100"/>
+              <w:bottom w:type="dxa" w:w="70"/>
+              <w:right w:type="dxa" w:w="100"/>
+            </w:tcMar>
+            <w:vAlign w:val="top"/>
+          </w:tcPr>
+          <w:p>
+            <w:pPr>
+              <w:spacing w:after="40"/>
+            </w:pPr>
+            <w:r>
+              <w:rPr>
+                <w:b/>
+                <w:bCs/>
+                <w:sz w:val="16"/>
+                <w:szCs w:val="16"/>
               </w:rPr>
               <w:t xml:space="preserve">Art. 83: boetes</w:t>
             </w:r>
@@ -8470,7 +9334,7 @@
         </w:tc>
         <w:tc>
           <w:tcPr>
-            <w:tcW w:type="dxa" w:w="2500"/>
+            <w:tcW w:type="dxa" w:w="2000"/>
             <w:shd w:fill="F7FAFC" w:color="auto" w:val="clear"/>
             <w:tcMar>
               <w:top w:type="dxa" w:w="70"/>
@@ -8488,8 +9352,8 @@
               <w:rPr>
                 <w:b w:val="false"/>
                 <w:bCs w:val="false"/>
-                <w:sz w:val="17"/>
-                <w:szCs w:val="17"/>
+                <w:sz w:val="16"/>
+                <w:szCs w:val="16"/>
               </w:rPr>
               <w:t xml:space="preserve">De AP kan boetes opleggen tot € 20 miljoen of 4% van de wereldwijde jaaromzet.</w:t>
             </w:r>
@@ -8497,7 +9361,7 @@
         </w:tc>
         <w:tc>
           <w:tcPr>
-            <w:tcW w:type="dxa" w:w="2516"/>
+            <w:tcW w:type="dxa" w:w="1960"/>
             <w:shd w:fill="F7FAFC" w:color="auto" w:val="clear"/>
             <w:tcMar>
               <w:top w:type="dxa" w:w="70"/>
@@ -8515,8 +9379,8 @@
               <w:rPr>
                 <w:b w:val="false"/>
                 <w:bCs w:val="false"/>
-                <w:sz w:val="17"/>
-                <w:szCs w:val="17"/>
+                <w:sz w:val="16"/>
+                <w:szCs w:val="16"/>
               </w:rPr>
               <w:t xml:space="preserve">Voor zover bekend geen boete; de snelle melding en communicatie werken verzachtend.</w:t>
             </w:r>
@@ -8524,7 +9388,7 @@
         </w:tc>
         <w:tc>
           <w:tcPr>
-            <w:tcW w:type="dxa" w:w="2516"/>
+            <w:tcW w:type="dxa" w:w="1960"/>
             <w:shd w:fill="F7FAFC" w:color="auto" w:val="clear"/>
             <w:tcMar>
               <w:top w:type="dxa" w:w="70"/>
@@ -8542,10 +9406,37 @@
               <w:rPr>
                 <w:b w:val="false"/>
                 <w:bCs w:val="false"/>
-                <w:sz w:val="17"/>
-                <w:szCs w:val="17"/>
+                <w:sz w:val="16"/>
+                <w:szCs w:val="16"/>
               </w:rPr>
               <w:t xml:space="preserve">Voor zover bekend geen boete.</w:t>
+            </w:r>
+          </w:p>
+        </w:tc>
+        <w:tc>
+          <w:tcPr>
+            <w:tcW w:type="dxa" w:w="1962"/>
+            <w:shd w:fill="F7FAFC" w:color="auto" w:val="clear"/>
+            <w:tcMar>
+              <w:top w:type="dxa" w:w="70"/>
+              <w:left w:type="dxa" w:w="100"/>
+              <w:bottom w:type="dxa" w:w="70"/>
+              <w:right w:type="dxa" w:w="100"/>
+            </w:tcMar>
+            <w:vAlign w:val="top"/>
+          </w:tcPr>
+          <w:p>
+            <w:pPr>
+              <w:spacing w:after="40"/>
+            </w:pPr>
+            <w:r>
+              <w:rPr>
+                <w:b w:val="false"/>
+                <w:bCs w:val="false"/>
+                <w:sz w:val="16"/>
+                <w:szCs w:val="16"/>
+              </w:rPr>
+              <w:t xml:space="preserve">Onderzoek loopt; voor zover bekend (nog) geen boete.</w:t>
             </w:r>
           </w:p>
         </w:tc>
@@ -8563,7 +9454,7 @@
           <w:sz w:val="18"/>
           <w:szCs w:val="18"/>
         </w:rPr>
-        <w:t xml:space="preserve">Tabel 9. Toepassing van de AVG op de twee incidenten bij Eneco. Bronnen: Verordening (EU) 2016/679 (2016); NOS (2024); Security.NL (2021, 2024a, 2024b).</w:t>
+        <w:t xml:space="preserve">Tabel 10. Toepassing van de AVG op de drie incidenten. Bronnen: Verordening (EU) 2016/679 (2016); NOS (2024); Security.NL (2021, 2024a, 2024b, 2026).</w:t>
       </w:r>
     </w:p>
     <w:p>
@@ -9214,7 +10105,7 @@
           <w:sz w:val="18"/>
           <w:szCs w:val="18"/>
         </w:rPr>
-        <w:t xml:space="preserve">Tabel 10. Vragen voor de gastspreker met onderbouwing.</w:t>
+        <w:t xml:space="preserve">Tabel 11. Vragen voor de gastspreker met onderbouwing.</w:t>
       </w:r>
     </w:p>
     <w:p>
@@ -9299,7 +10190,7 @@
         <w:t xml:space="preserve">Privacy is daarbij geen bijzaak.</w:t>
       </w:r>
       <w:r>
-        <w:t xml:space="preserve"> De incidenten bij Eneco (credential stuffing in 2021 en de ransomware-aanval bij verwerker AddComm in 2024) laten zien dat de AVG eist dat gegevens passend beveiligd zijn (art. 32), dat een organisatie verantwoordelijk blijft voor haar verwerkers (art. 28) en dat een lek binnen 72 uur bij de AP wordt gemeld en betrokkenen worden geïnformeerd (art. 33 en 34). Voor het datavraagstuk van Enexis betekent dit dat analyses op geaggregeerde of gepseudonimiseerde data moeten worden uitgevoerd. Met deze domeinkennis kunnen wij in de volgende sprint de data van Enexis beoordelen op wat logisch is en wat niet, precies het doel van </w:t>
+        <w:t xml:space="preserve"> De drie incidenten (credential stuffing bij Eneco in 2021, de ransomware-aanval bij verwerker AddComm in 2024 en de medewerker die bij Innova Energie klantgegevens stal in 2026) laten zien dat de AVG eist dat gegevens passend beveiligd zijn tegen aanvallen van buiten én van binnen (art. 32), dat een organisatie verantwoordelijk blijft voor haar verwerkers en medewerkers (art. 28 en 29) en dat een lek binnen 72 uur bij de AP wordt gemeld en betrokkenen worden geïnformeerd (art. 33 en 34). Voor het datavraagstuk van Enexis betekent dit dat analyses op geaggregeerde of gepseudonimiseerde data moeten worden uitgevoerd. Met deze domeinkennis kunnen wij in de volgende sprint de data van Enexis beoordelen op wat logisch is en wat niet, precies het doel van </w:t>
       </w:r>
       <w:r>
         <w:rPr>
@@ -10376,6 +11267,35 @@
           <w:szCs w:val="20"/>
         </w:rPr>
         <w:t xml:space="preserve">. https://www.security.nl/posting/843489/Eneco+waarschuwt+klanten+voor+datalek+bij+AddComm</w:t>
+      </w:r>
+    </w:p>
+    <w:p>
+      <w:pPr>
+        <w:spacing w:after="120"/>
+        <w:ind w:left="540" w:hanging="540"/>
+      </w:pPr>
+      <w:r>
+        <w:rPr>
+          <w:sz w:val="20"/>
+          <w:szCs w:val="20"/>
+        </w:rPr>
+        <w:t xml:space="preserve">Security.NL. (2026). </w:t>
+      </w:r>
+      <w:r>
+        <w:rPr>
+          <w:i/>
+          <w:iCs/>
+          <w:sz w:val="20"/>
+          <w:szCs w:val="20"/>
+        </w:rPr>
+        <w:t xml:space="preserve">Innova Energie waarschuwt klanten voor datalek van persoonsgegevens</w:t>
+      </w:r>
+      <w:r>
+        <w:rPr>
+          <w:sz w:val="20"/>
+          <w:szCs w:val="20"/>
+        </w:rPr>
+        <w:t xml:space="preserve">. https://www.security.nl/posting/929184/Innova+Energie+waarschuwt+klanten+voor+datalek+van+persoonsgegevens</w:t>
       </w:r>
     </w:p>
     <w:p>
@@ -18734,7 +19654,7 @@
                 <w:sz w:val="16"/>
                 <w:szCs w:val="16"/>
               </w:rPr>
-              <w:t xml:space="preserve">Selectra (z.d.)</w:t>
+              <w:t xml:space="preserve">Security.NL (2026)</w:t>
             </w:r>
           </w:p>
         </w:tc>
@@ -18760,7 +19680,7 @@
                 <w:sz w:val="16"/>
                 <w:szCs w:val="16"/>
               </w:rPr>
-              <w:t xml:space="preserve">Vergelijkingssite</w:t>
+              <w:t xml:space="preserve">Vaknieuws</w:t>
             </w:r>
           </w:p>
         </w:tc>
@@ -18786,6 +19706,58 @@
                 <w:sz w:val="16"/>
                 <w:szCs w:val="16"/>
               </w:rPr>
+              <w:t xml:space="preserve">5</w:t>
+            </w:r>
+          </w:p>
+        </w:tc>
+        <w:tc>
+          <w:tcPr>
+            <w:tcW w:type="dxa" w:w="400"/>
+            <w:tcMar>
+              <w:top w:type="dxa" w:w="70"/>
+              <w:left w:type="dxa" w:w="100"/>
+              <w:bottom w:type="dxa" w:w="70"/>
+              <w:right w:type="dxa" w:w="100"/>
+            </w:tcMar>
+            <w:vAlign w:val="top"/>
+          </w:tcPr>
+          <w:p>
+            <w:pPr>
+              <w:spacing w:after="40"/>
+            </w:pPr>
+            <w:r>
+              <w:rPr>
+                <w:b w:val="false"/>
+                <w:bCs w:val="false"/>
+                <w:sz w:val="16"/>
+                <w:szCs w:val="16"/>
+              </w:rPr>
+              <w:t xml:space="preserve">5</w:t>
+            </w:r>
+          </w:p>
+        </w:tc>
+        <w:tc>
+          <w:tcPr>
+            <w:tcW w:type="dxa" w:w="400"/>
+            <w:tcMar>
+              <w:top w:type="dxa" w:w="70"/>
+              <w:left w:type="dxa" w:w="100"/>
+              <w:bottom w:type="dxa" w:w="70"/>
+              <w:right w:type="dxa" w:w="100"/>
+            </w:tcMar>
+            <w:vAlign w:val="top"/>
+          </w:tcPr>
+          <w:p>
+            <w:pPr>
+              <w:spacing w:after="40"/>
+            </w:pPr>
+            <w:r>
+              <w:rPr>
+                <w:b w:val="false"/>
+                <w:bCs w:val="false"/>
+                <w:sz w:val="16"/>
+                <w:szCs w:val="16"/>
+              </w:rPr>
               <w:t xml:space="preserve">4</w:t>
             </w:r>
           </w:p>
@@ -18812,7 +19784,7 @@
                 <w:sz w:val="16"/>
                 <w:szCs w:val="16"/>
               </w:rPr>
-              <w:t xml:space="preserve">5</w:t>
+              <w:t xml:space="preserve">4</w:t>
             </w:r>
           </w:p>
         </w:tc>
@@ -18838,64 +19810,12 @@
                 <w:sz w:val="16"/>
                 <w:szCs w:val="16"/>
               </w:rPr>
-              <w:t xml:space="preserve">2</w:t>
-            </w:r>
-          </w:p>
-        </w:tc>
-        <w:tc>
-          <w:tcPr>
-            <w:tcW w:type="dxa" w:w="400"/>
-            <w:tcMar>
-              <w:top w:type="dxa" w:w="70"/>
-              <w:left w:type="dxa" w:w="100"/>
-              <w:bottom w:type="dxa" w:w="70"/>
-              <w:right w:type="dxa" w:w="100"/>
-            </w:tcMar>
-            <w:vAlign w:val="top"/>
-          </w:tcPr>
-          <w:p>
-            <w:pPr>
-              <w:spacing w:after="40"/>
-            </w:pPr>
-            <w:r>
-              <w:rPr>
-                <w:b w:val="false"/>
-                <w:bCs w:val="false"/>
-                <w:sz w:val="16"/>
-                <w:szCs w:val="16"/>
-              </w:rPr>
               <w:t xml:space="preserve">4</w:t>
             </w:r>
           </w:p>
         </w:tc>
         <w:tc>
           <w:tcPr>
-            <w:tcW w:type="dxa" w:w="400"/>
-            <w:tcMar>
-              <w:top w:type="dxa" w:w="70"/>
-              <w:left w:type="dxa" w:w="100"/>
-              <w:bottom w:type="dxa" w:w="70"/>
-              <w:right w:type="dxa" w:w="100"/>
-            </w:tcMar>
-            <w:vAlign w:val="top"/>
-          </w:tcPr>
-          <w:p>
-            <w:pPr>
-              <w:spacing w:after="40"/>
-            </w:pPr>
-            <w:r>
-              <w:rPr>
-                <w:b w:val="false"/>
-                <w:bCs w:val="false"/>
-                <w:sz w:val="16"/>
-                <w:szCs w:val="16"/>
-              </w:rPr>
-              <w:t xml:space="preserve">2</w:t>
-            </w:r>
-          </w:p>
-        </w:tc>
-        <w:tc>
-          <w:tcPr>
             <w:tcW w:type="dxa" w:w="3932"/>
             <w:tcMar>
               <w:top w:type="dxa" w:w="70"/>
@@ -18916,7 +19836,7 @@
                 <w:sz w:val="16"/>
                 <w:szCs w:val="16"/>
               </w:rPr>
-              <w:t xml:space="preserve">Bruikbaar voor de uitleg; tarieven bij voorkeur bij de Belastingdienst controleren.</w:t>
+              <w:t xml:space="preserve">Betrouwbaar; let op dat de omvang van het lek onbekend is.</w:t>
             </w:r>
           </w:p>
         </w:tc>
@@ -18948,7 +19868,7 @@
                 <w:sz w:val="16"/>
                 <w:szCs w:val="16"/>
               </w:rPr>
-              <w:t xml:space="preserve">Solar Magazine (2025)</w:t>
+              <w:t xml:space="preserve">Selectra (z.d.)</w:t>
             </w:r>
           </w:p>
         </w:tc>
@@ -18975,7 +19895,7 @@
                 <w:sz w:val="16"/>
                 <w:szCs w:val="16"/>
               </w:rPr>
-              <w:t xml:space="preserve">Vakmedium</w:t>
+              <w:t xml:space="preserve">Vergelijkingssite</w:t>
             </w:r>
           </w:p>
         </w:tc>
@@ -19002,7 +19922,7 @@
                 <w:sz w:val="16"/>
                 <w:szCs w:val="16"/>
               </w:rPr>
-              <w:t xml:space="preserve">5</w:t>
+              <w:t xml:space="preserve">4</w:t>
             </w:r>
           </w:p>
         </w:tc>
@@ -19029,7 +19949,7 @@
                 <w:sz w:val="16"/>
                 <w:szCs w:val="16"/>
               </w:rPr>
-              <w:t xml:space="preserve">4</w:t>
+              <w:t xml:space="preserve">5</w:t>
             </w:r>
           </w:p>
         </w:tc>
@@ -19056,7 +19976,7 @@
                 <w:sz w:val="16"/>
                 <w:szCs w:val="16"/>
               </w:rPr>
-              <w:t xml:space="preserve">3</w:t>
+              <w:t xml:space="preserve">2</w:t>
             </w:r>
           </w:p>
         </w:tc>
@@ -19110,7 +20030,7 @@
                 <w:sz w:val="16"/>
                 <w:szCs w:val="16"/>
               </w:rPr>
-              <w:t xml:space="preserve">3</w:t>
+              <w:t xml:space="preserve">2</w:t>
             </w:r>
           </w:p>
         </w:tc>
@@ -19137,7 +20057,7 @@
                 <w:sz w:val="16"/>
                 <w:szCs w:val="16"/>
               </w:rPr>
-              <w:t xml:space="preserve">Bruikbaar; cijfer is CBS-gebaseerd.</w:t>
+              <w:t xml:space="preserve">Bruikbaar voor de uitleg; tarieven bij voorkeur bij de Belastingdienst controleren.</w:t>
             </w:r>
           </w:p>
         </w:tc>
@@ -19168,7 +20088,7 @@
                 <w:sz w:val="16"/>
                 <w:szCs w:val="16"/>
               </w:rPr>
-              <w:t xml:space="preserve">Solar Magazine (2026a)</w:t>
+              <w:t xml:space="preserve">Solar Magazine (2025)</w:t>
             </w:r>
           </w:p>
         </w:tc>
@@ -19246,7 +20166,7 @@
                 <w:sz w:val="16"/>
                 <w:szCs w:val="16"/>
               </w:rPr>
-              <w:t xml:space="preserve">5</w:t>
+              <w:t xml:space="preserve">4</w:t>
             </w:r>
           </w:p>
         </w:tc>
@@ -19350,7 +20270,7 @@
                 <w:sz w:val="16"/>
                 <w:szCs w:val="16"/>
               </w:rPr>
-              <w:t xml:space="preserve">Bruikbaar.</w:t>
+              <w:t xml:space="preserve">Bruikbaar; cijfer is CBS-gebaseerd.</w:t>
             </w:r>
           </w:p>
         </w:tc>
@@ -19382,7 +20302,7 @@
                 <w:sz w:val="16"/>
                 <w:szCs w:val="16"/>
               </w:rPr>
-              <w:t xml:space="preserve">Solar Magazine (2026b)</w:t>
+              <w:t xml:space="preserve">Solar Magazine (2026a)</w:t>
             </w:r>
           </w:p>
         </w:tc>
@@ -19571,7 +20491,7 @@
                 <w:sz w:val="16"/>
                 <w:szCs w:val="16"/>
               </w:rPr>
-              <w:t xml:space="preserve">Bruikbaar; primaire bron zijn de updates van Enexis zelf.</w:t>
+              <w:t xml:space="preserve">Bruikbaar.</w:t>
             </w:r>
           </w:p>
         </w:tc>
@@ -19602,7 +20522,7 @@
                 <w:sz w:val="16"/>
                 <w:szCs w:val="16"/>
               </w:rPr>
-              <w:t xml:space="preserve">Vattenfall (z.d.)</w:t>
+              <w:t xml:space="preserve">Solar Magazine (2026b)</w:t>
             </w:r>
           </w:p>
         </w:tc>
@@ -19628,7 +20548,7 @@
                 <w:sz w:val="16"/>
                 <w:szCs w:val="16"/>
               </w:rPr>
-              <w:t xml:space="preserve">Kennisbank leverancier</w:t>
+              <w:t xml:space="preserve">Vakmedium</w:t>
             </w:r>
           </w:p>
         </w:tc>
@@ -19654,6 +20574,84 @@
                 <w:sz w:val="16"/>
                 <w:szCs w:val="16"/>
               </w:rPr>
+              <w:t xml:space="preserve">5</w:t>
+            </w:r>
+          </w:p>
+        </w:tc>
+        <w:tc>
+          <w:tcPr>
+            <w:tcW w:type="dxa" w:w="400"/>
+            <w:tcMar>
+              <w:top w:type="dxa" w:w="70"/>
+              <w:left w:type="dxa" w:w="100"/>
+              <w:bottom w:type="dxa" w:w="70"/>
+              <w:right w:type="dxa" w:w="100"/>
+            </w:tcMar>
+            <w:vAlign w:val="top"/>
+          </w:tcPr>
+          <w:p>
+            <w:pPr>
+              <w:spacing w:after="40"/>
+            </w:pPr>
+            <w:r>
+              <w:rPr>
+                <w:b w:val="false"/>
+                <w:bCs w:val="false"/>
+                <w:sz w:val="16"/>
+                <w:szCs w:val="16"/>
+              </w:rPr>
+              <w:t xml:space="preserve">5</w:t>
+            </w:r>
+          </w:p>
+        </w:tc>
+        <w:tc>
+          <w:tcPr>
+            <w:tcW w:type="dxa" w:w="400"/>
+            <w:tcMar>
+              <w:top w:type="dxa" w:w="70"/>
+              <w:left w:type="dxa" w:w="100"/>
+              <w:bottom w:type="dxa" w:w="70"/>
+              <w:right w:type="dxa" w:w="100"/>
+            </w:tcMar>
+            <w:vAlign w:val="top"/>
+          </w:tcPr>
+          <w:p>
+            <w:pPr>
+              <w:spacing w:after="40"/>
+            </w:pPr>
+            <w:r>
+              <w:rPr>
+                <w:b w:val="false"/>
+                <w:bCs w:val="false"/>
+                <w:sz w:val="16"/>
+                <w:szCs w:val="16"/>
+              </w:rPr>
+              <w:t xml:space="preserve">3</w:t>
+            </w:r>
+          </w:p>
+        </w:tc>
+        <w:tc>
+          <w:tcPr>
+            <w:tcW w:type="dxa" w:w="400"/>
+            <w:tcMar>
+              <w:top w:type="dxa" w:w="70"/>
+              <w:left w:type="dxa" w:w="100"/>
+              <w:bottom w:type="dxa" w:w="70"/>
+              <w:right w:type="dxa" w:w="100"/>
+            </w:tcMar>
+            <w:vAlign w:val="top"/>
+          </w:tcPr>
+          <w:p>
+            <w:pPr>
+              <w:spacing w:after="40"/>
+            </w:pPr>
+            <w:r>
+              <w:rPr>
+                <w:b w:val="false"/>
+                <w:bCs w:val="false"/>
+                <w:sz w:val="16"/>
+                <w:szCs w:val="16"/>
+              </w:rPr>
               <w:t xml:space="preserve">4</w:t>
             </w:r>
           </w:p>
@@ -19680,90 +20678,12 @@
                 <w:sz w:val="16"/>
                 <w:szCs w:val="16"/>
               </w:rPr>
-              <w:t xml:space="preserve">4</w:t>
-            </w:r>
-          </w:p>
-        </w:tc>
-        <w:tc>
-          <w:tcPr>
-            <w:tcW w:type="dxa" w:w="400"/>
-            <w:tcMar>
-              <w:top w:type="dxa" w:w="70"/>
-              <w:left w:type="dxa" w:w="100"/>
-              <w:bottom w:type="dxa" w:w="70"/>
-              <w:right w:type="dxa" w:w="100"/>
-            </w:tcMar>
-            <w:vAlign w:val="top"/>
-          </w:tcPr>
-          <w:p>
-            <w:pPr>
-              <w:spacing w:after="40"/>
-            </w:pPr>
-            <w:r>
-              <w:rPr>
-                <w:b w:val="false"/>
-                <w:bCs w:val="false"/>
-                <w:sz w:val="16"/>
-                <w:szCs w:val="16"/>
-              </w:rPr>
               <w:t xml:space="preserve">3</w:t>
             </w:r>
           </w:p>
         </w:tc>
         <w:tc>
           <w:tcPr>
-            <w:tcW w:type="dxa" w:w="400"/>
-            <w:tcMar>
-              <w:top w:type="dxa" w:w="70"/>
-              <w:left w:type="dxa" w:w="100"/>
-              <w:bottom w:type="dxa" w:w="70"/>
-              <w:right w:type="dxa" w:w="100"/>
-            </w:tcMar>
-            <w:vAlign w:val="top"/>
-          </w:tcPr>
-          <w:p>
-            <w:pPr>
-              <w:spacing w:after="40"/>
-            </w:pPr>
-            <w:r>
-              <w:rPr>
-                <w:b w:val="false"/>
-                <w:bCs w:val="false"/>
-                <w:sz w:val="16"/>
-                <w:szCs w:val="16"/>
-              </w:rPr>
-              <w:t xml:space="preserve">4</w:t>
-            </w:r>
-          </w:p>
-        </w:tc>
-        <w:tc>
-          <w:tcPr>
-            <w:tcW w:type="dxa" w:w="400"/>
-            <w:tcMar>
-              <w:top w:type="dxa" w:w="70"/>
-              <w:left w:type="dxa" w:w="100"/>
-              <w:bottom w:type="dxa" w:w="70"/>
-              <w:right w:type="dxa" w:w="100"/>
-            </w:tcMar>
-            <w:vAlign w:val="top"/>
-          </w:tcPr>
-          <w:p>
-            <w:pPr>
-              <w:spacing w:after="40"/>
-            </w:pPr>
-            <w:r>
-              <w:rPr>
-                <w:b w:val="false"/>
-                <w:bCs w:val="false"/>
-                <w:sz w:val="16"/>
-                <w:szCs w:val="16"/>
-              </w:rPr>
-              <w:t xml:space="preserve">3</w:t>
-            </w:r>
-          </w:p>
-        </w:tc>
-        <w:tc>
-          <w:tcPr>
             <w:tcW w:type="dxa" w:w="3932"/>
             <w:tcMar>
               <w:top w:type="dxa" w:w="70"/>
@@ -19784,7 +20704,7 @@
                 <w:sz w:val="16"/>
                 <w:szCs w:val="16"/>
               </w:rPr>
-              <w:t xml:space="preserve">Bruikbaar als controlebron.</w:t>
+              <w:t xml:space="preserve">Bruikbaar; primaire bron zijn de updates van Enexis zelf.</w:t>
             </w:r>
           </w:p>
         </w:tc>
@@ -19816,7 +20736,7 @@
                 <w:sz w:val="16"/>
                 <w:szCs w:val="16"/>
               </w:rPr>
-              <w:t xml:space="preserve">Verordening (EU) 2016/679 (2016)</w:t>
+              <w:t xml:space="preserve">Vattenfall (z.d.)</w:t>
             </w:r>
           </w:p>
         </w:tc>
@@ -19843,7 +20763,7 @@
                 <w:sz w:val="16"/>
                 <w:szCs w:val="16"/>
               </w:rPr>
-              <w:t xml:space="preserve">Wetgeving</w:t>
+              <w:t xml:space="preserve">Kennisbank leverancier</w:t>
             </w:r>
           </w:p>
         </w:tc>
@@ -19870,7 +20790,7 @@
                 <w:sz w:val="16"/>
                 <w:szCs w:val="16"/>
               </w:rPr>
-              <w:t xml:space="preserve">5</w:t>
+              <w:t xml:space="preserve">4</w:t>
             </w:r>
           </w:p>
         </w:tc>
@@ -19897,7 +20817,7 @@
                 <w:sz w:val="16"/>
                 <w:szCs w:val="16"/>
               </w:rPr>
-              <w:t xml:space="preserve">5</w:t>
+              <w:t xml:space="preserve">4</w:t>
             </w:r>
           </w:p>
         </w:tc>
@@ -19924,7 +20844,7 @@
                 <w:sz w:val="16"/>
                 <w:szCs w:val="16"/>
               </w:rPr>
-              <w:t xml:space="preserve">5</w:t>
+              <w:t xml:space="preserve">3</w:t>
             </w:r>
           </w:p>
         </w:tc>
@@ -19951,7 +20871,7 @@
                 <w:sz w:val="16"/>
                 <w:szCs w:val="16"/>
               </w:rPr>
-              <w:t xml:space="preserve">5</w:t>
+              <w:t xml:space="preserve">4</w:t>
             </w:r>
           </w:p>
         </w:tc>
@@ -19978,7 +20898,7 @@
                 <w:sz w:val="16"/>
                 <w:szCs w:val="16"/>
               </w:rPr>
-              <w:t xml:space="preserve">5</w:t>
+              <w:t xml:space="preserve">3</w:t>
             </w:r>
           </w:p>
         </w:tc>
@@ -20005,7 +20925,7 @@
                 <w:sz w:val="16"/>
                 <w:szCs w:val="16"/>
               </w:rPr>
-              <w:t xml:space="preserve">Primaire bron; hoogste betrouwbaarheid.</w:t>
+              <w:t xml:space="preserve">Bruikbaar als controlebron.</w:t>
             </w:r>
           </w:p>
         </w:tc>
@@ -20036,6 +20956,220 @@
                 <w:sz w:val="16"/>
                 <w:szCs w:val="16"/>
               </w:rPr>
+              <w:t xml:space="preserve">Verordening (EU) 2016/679 (2016)</w:t>
+            </w:r>
+          </w:p>
+        </w:tc>
+        <w:tc>
+          <w:tcPr>
+            <w:tcW w:type="dxa" w:w="1500"/>
+            <w:tcMar>
+              <w:top w:type="dxa" w:w="70"/>
+              <w:left w:type="dxa" w:w="100"/>
+              <w:bottom w:type="dxa" w:w="70"/>
+              <w:right w:type="dxa" w:w="100"/>
+            </w:tcMar>
+            <w:vAlign w:val="top"/>
+          </w:tcPr>
+          <w:p>
+            <w:pPr>
+              <w:spacing w:after="40"/>
+            </w:pPr>
+            <w:r>
+              <w:rPr>
+                <w:b w:val="false"/>
+                <w:bCs w:val="false"/>
+                <w:sz w:val="16"/>
+                <w:szCs w:val="16"/>
+              </w:rPr>
+              <w:t xml:space="preserve">Wetgeving</w:t>
+            </w:r>
+          </w:p>
+        </w:tc>
+        <w:tc>
+          <w:tcPr>
+            <w:tcW w:type="dxa" w:w="400"/>
+            <w:tcMar>
+              <w:top w:type="dxa" w:w="70"/>
+              <w:left w:type="dxa" w:w="100"/>
+              <w:bottom w:type="dxa" w:w="70"/>
+              <w:right w:type="dxa" w:w="100"/>
+            </w:tcMar>
+            <w:vAlign w:val="top"/>
+          </w:tcPr>
+          <w:p>
+            <w:pPr>
+              <w:spacing w:after="40"/>
+            </w:pPr>
+            <w:r>
+              <w:rPr>
+                <w:b w:val="false"/>
+                <w:bCs w:val="false"/>
+                <w:sz w:val="16"/>
+                <w:szCs w:val="16"/>
+              </w:rPr>
+              <w:t xml:space="preserve">5</w:t>
+            </w:r>
+          </w:p>
+        </w:tc>
+        <w:tc>
+          <w:tcPr>
+            <w:tcW w:type="dxa" w:w="400"/>
+            <w:tcMar>
+              <w:top w:type="dxa" w:w="70"/>
+              <w:left w:type="dxa" w:w="100"/>
+              <w:bottom w:type="dxa" w:w="70"/>
+              <w:right w:type="dxa" w:w="100"/>
+            </w:tcMar>
+            <w:vAlign w:val="top"/>
+          </w:tcPr>
+          <w:p>
+            <w:pPr>
+              <w:spacing w:after="40"/>
+            </w:pPr>
+            <w:r>
+              <w:rPr>
+                <w:b w:val="false"/>
+                <w:bCs w:val="false"/>
+                <w:sz w:val="16"/>
+                <w:szCs w:val="16"/>
+              </w:rPr>
+              <w:t xml:space="preserve">5</w:t>
+            </w:r>
+          </w:p>
+        </w:tc>
+        <w:tc>
+          <w:tcPr>
+            <w:tcW w:type="dxa" w:w="400"/>
+            <w:tcMar>
+              <w:top w:type="dxa" w:w="70"/>
+              <w:left w:type="dxa" w:w="100"/>
+              <w:bottom w:type="dxa" w:w="70"/>
+              <w:right w:type="dxa" w:w="100"/>
+            </w:tcMar>
+            <w:vAlign w:val="top"/>
+          </w:tcPr>
+          <w:p>
+            <w:pPr>
+              <w:spacing w:after="40"/>
+            </w:pPr>
+            <w:r>
+              <w:rPr>
+                <w:b w:val="false"/>
+                <w:bCs w:val="false"/>
+                <w:sz w:val="16"/>
+                <w:szCs w:val="16"/>
+              </w:rPr>
+              <w:t xml:space="preserve">5</w:t>
+            </w:r>
+          </w:p>
+        </w:tc>
+        <w:tc>
+          <w:tcPr>
+            <w:tcW w:type="dxa" w:w="400"/>
+            <w:tcMar>
+              <w:top w:type="dxa" w:w="70"/>
+              <w:left w:type="dxa" w:w="100"/>
+              <w:bottom w:type="dxa" w:w="70"/>
+              <w:right w:type="dxa" w:w="100"/>
+            </w:tcMar>
+            <w:vAlign w:val="top"/>
+          </w:tcPr>
+          <w:p>
+            <w:pPr>
+              <w:spacing w:after="40"/>
+            </w:pPr>
+            <w:r>
+              <w:rPr>
+                <w:b w:val="false"/>
+                <w:bCs w:val="false"/>
+                <w:sz w:val="16"/>
+                <w:szCs w:val="16"/>
+              </w:rPr>
+              <w:t xml:space="preserve">5</w:t>
+            </w:r>
+          </w:p>
+        </w:tc>
+        <w:tc>
+          <w:tcPr>
+            <w:tcW w:type="dxa" w:w="400"/>
+            <w:tcMar>
+              <w:top w:type="dxa" w:w="70"/>
+              <w:left w:type="dxa" w:w="100"/>
+              <w:bottom w:type="dxa" w:w="70"/>
+              <w:right w:type="dxa" w:w="100"/>
+            </w:tcMar>
+            <w:vAlign w:val="top"/>
+          </w:tcPr>
+          <w:p>
+            <w:pPr>
+              <w:spacing w:after="40"/>
+            </w:pPr>
+            <w:r>
+              <w:rPr>
+                <w:b w:val="false"/>
+                <w:bCs w:val="false"/>
+                <w:sz w:val="16"/>
+                <w:szCs w:val="16"/>
+              </w:rPr>
+              <w:t xml:space="preserve">5</w:t>
+            </w:r>
+          </w:p>
+        </w:tc>
+        <w:tc>
+          <w:tcPr>
+            <w:tcW w:type="dxa" w:w="3932"/>
+            <w:tcMar>
+              <w:top w:type="dxa" w:w="70"/>
+              <w:left w:type="dxa" w:w="100"/>
+              <w:bottom w:type="dxa" w:w="70"/>
+              <w:right w:type="dxa" w:w="100"/>
+            </w:tcMar>
+            <w:vAlign w:val="top"/>
+          </w:tcPr>
+          <w:p>
+            <w:pPr>
+              <w:spacing w:after="40"/>
+            </w:pPr>
+            <w:r>
+              <w:rPr>
+                <w:b w:val="false"/>
+                <w:bCs w:val="false"/>
+                <w:sz w:val="16"/>
+                <w:szCs w:val="16"/>
+              </w:rPr>
+              <w:t xml:space="preserve">Primaire bron; hoogste betrouwbaarheid.</w:t>
+            </w:r>
+          </w:p>
+        </w:tc>
+      </w:tr>
+      <w:tr>
+        <w:trPr>
+          <w:cantSplit/>
+        </w:trPr>
+        <w:tc>
+          <w:tcPr>
+            <w:tcW w:type="dxa" w:w="2200"/>
+            <w:shd w:fill="F7FAFC" w:color="auto" w:val="clear"/>
+            <w:tcMar>
+              <w:top w:type="dxa" w:w="70"/>
+              <w:left w:type="dxa" w:w="100"/>
+              <w:bottom w:type="dxa" w:w="70"/>
+              <w:right w:type="dxa" w:w="100"/>
+            </w:tcMar>
+            <w:vAlign w:val="top"/>
+          </w:tcPr>
+          <w:p>
+            <w:pPr>
+              <w:spacing w:after="40"/>
+            </w:pPr>
+            <w:r>
+              <w:rPr>
+                <w:b/>
+                <w:bCs/>
+                <w:sz w:val="16"/>
+                <w:szCs w:val="16"/>
+              </w:rPr>
               <w:t xml:space="preserve">WISE (z.d.)</w:t>
             </w:r>
           </w:p>
@@ -20043,6 +21177,7 @@
         <w:tc>
           <w:tcPr>
             <w:tcW w:type="dxa" w:w="1500"/>
+            <w:shd w:fill="F7FAFC" w:color="auto" w:val="clear"/>
             <w:tcMar>
               <w:top w:type="dxa" w:w="70"/>
               <w:left w:type="dxa" w:w="100"/>
@@ -20069,6 +21204,7 @@
         <w:tc>
           <w:tcPr>
             <w:tcW w:type="dxa" w:w="400"/>
+            <w:shd w:fill="F7FAFC" w:color="auto" w:val="clear"/>
             <w:tcMar>
               <w:top w:type="dxa" w:w="70"/>
               <w:left w:type="dxa" w:w="100"/>
@@ -20095,6 +21231,7 @@
         <w:tc>
           <w:tcPr>
             <w:tcW w:type="dxa" w:w="400"/>
+            <w:shd w:fill="F7FAFC" w:color="auto" w:val="clear"/>
             <w:tcMar>
               <w:top w:type="dxa" w:w="70"/>
               <w:left w:type="dxa" w:w="100"/>
@@ -20121,6 +21258,7 @@
         <w:tc>
           <w:tcPr>
             <w:tcW w:type="dxa" w:w="400"/>
+            <w:shd w:fill="F7FAFC" w:color="auto" w:val="clear"/>
             <w:tcMar>
               <w:top w:type="dxa" w:w="70"/>
               <w:left w:type="dxa" w:w="100"/>
@@ -20147,6 +21285,7 @@
         <w:tc>
           <w:tcPr>
             <w:tcW w:type="dxa" w:w="400"/>
+            <w:shd w:fill="F7FAFC" w:color="auto" w:val="clear"/>
             <w:tcMar>
               <w:top w:type="dxa" w:w="70"/>
               <w:left w:type="dxa" w:w="100"/>
@@ -20173,6 +21312,7 @@
         <w:tc>
           <w:tcPr>
             <w:tcW w:type="dxa" w:w="400"/>
+            <w:shd w:fill="F7FAFC" w:color="auto" w:val="clear"/>
             <w:tcMar>
               <w:top w:type="dxa" w:w="70"/>
               <w:left w:type="dxa" w:w="100"/>
@@ -20199,6 +21339,7 @@
         <w:tc>
           <w:tcPr>
             <w:tcW w:type="dxa" w:w="3932"/>
+            <w:shd w:fill="F7FAFC" w:color="auto" w:val="clear"/>
             <w:tcMar>
               <w:top w:type="dxa" w:w="70"/>
               <w:left w:type="dxa" w:w="100"/>
@@ -27984,7 +29125,7 @@
         <w:pStyle w:val="Heading3"/>
       </w:pPr>
       <w:r>
-        <w:t xml:space="preserve">Selectra (z.d.)</w:t>
+        <w:t xml:space="preserve">Security.NL (2026)</w:t>
       </w:r>
     </w:p>
     <w:p>
@@ -27998,7 +29139,7 @@
           <w:sz w:val="19"/>
           <w:szCs w:val="19"/>
         </w:rPr>
-        <w:t xml:space="preserve">Bron: Selectra. (z.d.). Energierekening: opbouw en kosten. [vergelijkingssite]</w:t>
+        <w:t xml:space="preserve">Bron: Security.NL. (2026). Innova Energie waarschuwt klanten voor datalek van persoonsgegevens. [vaknieuws]</w:t>
       </w:r>
     </w:p>
     <w:p>
@@ -28025,14 +29166,14 @@
           <w:sz w:val="19"/>
           <w:szCs w:val="19"/>
         </w:rPr>
-        <w:t xml:space="preserve">★★★★☆ </w:t>
-      </w:r>
-      <w:r>
-        <w:rPr>
-          <w:sz w:val="19"/>
-          <w:szCs w:val="19"/>
-        </w:rPr>
-        <w:t xml:space="preserve">Bevat de tarieven van 2026, dus actueel.</w:t>
+        <w:t xml:space="preserve">★★★★★ </w:t>
+      </w:r>
+      <w:r>
+        <w:rPr>
+          <w:sz w:val="19"/>
+          <w:szCs w:val="19"/>
+        </w:rPr>
+        <w:t xml:space="preserve">19 maart 2026, direct na de waarschuwing van Innova Energie; de meest recente bron in dit rapport.</w:t>
       </w:r>
     </w:p>
     <w:p>
@@ -28066,7 +29207,7 @@
           <w:sz w:val="19"/>
           <w:szCs w:val="19"/>
         </w:rPr>
-        <w:t xml:space="preserve">Legt de vier onderdelen van de energierekening helder uit.</w:t>
+        <w:t xml:space="preserve">Beschrijft het derde privacy-incident, met een andere oorzaak (dader van binnenuit) dan de twee Eneco-incidenten.</w:t>
       </w:r>
     </w:p>
     <w:p>
@@ -28093,14 +29234,14 @@
           <w:sz w:val="19"/>
           <w:szCs w:val="19"/>
         </w:rPr>
-        <w:t xml:space="preserve">★★☆☆☆ </w:t>
-      </w:r>
-      <w:r>
-        <w:rPr>
-          <w:sz w:val="19"/>
-          <w:szCs w:val="19"/>
-        </w:rPr>
-        <w:t xml:space="preserve">Commerciële vergelijkingssite.</w:t>
+        <w:t xml:space="preserve">★★★★☆ </w:t>
+      </w:r>
+      <w:r>
+        <w:rPr>
+          <w:sz w:val="19"/>
+          <w:szCs w:val="19"/>
+        </w:rPr>
+        <w:t xml:space="preserve">Gespecialiseerde beveiligingsnieuwssite, veel gebruikt in de sector.</w:t>
       </w:r>
     </w:p>
     <w:p>
@@ -28134,7 +29275,7 @@
           <w:sz w:val="19"/>
           <w:szCs w:val="19"/>
         </w:rPr>
-        <w:t xml:space="preserve">Tarieven komen overeen met de Belastingdienst.</w:t>
+        <w:t xml:space="preserve">Gebaseerd op de verklaring van Innova Energie zelf; het aantal getroffen klanten is niet bekendgemaakt.</w:t>
       </w:r>
     </w:p>
     <w:p>
@@ -28161,14 +29302,14 @@
           <w:sz w:val="19"/>
           <w:szCs w:val="19"/>
         </w:rPr>
-        <w:t xml:space="preserve">★★☆☆☆ </w:t>
-      </w:r>
-      <w:r>
-        <w:rPr>
-          <w:sz w:val="19"/>
-          <w:szCs w:val="19"/>
-        </w:rPr>
-        <w:t xml:space="preserve">Verdient aan overstappen.</w:t>
+        <w:t xml:space="preserve">★★★★☆ </w:t>
+      </w:r>
+      <w:r>
+        <w:rPr>
+          <w:sz w:val="19"/>
+          <w:szCs w:val="19"/>
+        </w:rPr>
+        <w:t xml:space="preserve">Informeren van beveiligingsprofessionals.</w:t>
       </w:r>
     </w:p>
     <w:p>
@@ -28191,7 +29332,7 @@
           <w:sz w:val="19"/>
           <w:szCs w:val="19"/>
         </w:rPr>
-        <w:t xml:space="preserve">Bruikbaar voor de uitleg; tarieven bij voorkeur bij de Belastingdienst controleren.</w:t>
+        <w:t xml:space="preserve">Betrouwbaar; let op dat de omvang van het lek onbekend is.</w:t>
       </w:r>
     </w:p>
     <w:p>
@@ -28199,7 +29340,7 @@
         <w:pStyle w:val="Heading3"/>
       </w:pPr>
       <w:r>
-        <w:t xml:space="preserve">Solar Magazine (2025)</w:t>
+        <w:t xml:space="preserve">Selectra (z.d.)</w:t>
       </w:r>
     </w:p>
     <w:p>
@@ -28213,7 +29354,7 @@
           <w:sz w:val="19"/>
           <w:szCs w:val="19"/>
         </w:rPr>
-        <w:t xml:space="preserve">Bron: Solar Magazine. (2025). Zonnepanelen goed voor 20 procent van Nederlandse stroomproductie. [vakmedium]</w:t>
+        <w:t xml:space="preserve">Bron: Selectra. (z.d.). Energierekening: opbouw en kosten. [vergelijkingssite]</w:t>
       </w:r>
     </w:p>
     <w:p>
@@ -28240,14 +29381,14 @@
           <w:sz w:val="19"/>
           <w:szCs w:val="19"/>
         </w:rPr>
-        <w:t xml:space="preserve">★★★★★ </w:t>
-      </w:r>
-      <w:r>
-        <w:rPr>
-          <w:sz w:val="19"/>
-          <w:szCs w:val="19"/>
-        </w:rPr>
-        <w:t xml:space="preserve">2025, over 2024.</w:t>
+        <w:t xml:space="preserve">★★★★☆ </w:t>
+      </w:r>
+      <w:r>
+        <w:rPr>
+          <w:sz w:val="19"/>
+          <w:szCs w:val="19"/>
+        </w:rPr>
+        <w:t xml:space="preserve">Bevat de tarieven van 2026, dus actueel.</w:t>
       </w:r>
     </w:p>
     <w:p>
@@ -28274,14 +29415,14 @@
           <w:sz w:val="19"/>
           <w:szCs w:val="19"/>
         </w:rPr>
-        <w:t xml:space="preserve">★★★★☆ </w:t>
-      </w:r>
-      <w:r>
-        <w:rPr>
-          <w:sz w:val="19"/>
-          <w:szCs w:val="19"/>
-        </w:rPr>
-        <w:t xml:space="preserve">Aandeel zonnestroom als oorzaak van overcapaciteit.</w:t>
+        <w:t xml:space="preserve">★★★★★ </w:t>
+      </w:r>
+      <w:r>
+        <w:rPr>
+          <w:sz w:val="19"/>
+          <w:szCs w:val="19"/>
+        </w:rPr>
+        <w:t xml:space="preserve">Legt de vier onderdelen van de energierekening helder uit.</w:t>
       </w:r>
     </w:p>
     <w:p>
@@ -28308,14 +29449,14 @@
           <w:sz w:val="19"/>
           <w:szCs w:val="19"/>
         </w:rPr>
-        <w:t xml:space="preserve">★★★☆☆ </w:t>
-      </w:r>
-      <w:r>
-        <w:rPr>
-          <w:sz w:val="19"/>
-          <w:szCs w:val="19"/>
-        </w:rPr>
-        <w:t xml:space="preserve">Vakblad voor de zonne-energiesector; neemt CBS-cijfers over.</w:t>
+        <w:t xml:space="preserve">★★☆☆☆ </w:t>
+      </w:r>
+      <w:r>
+        <w:rPr>
+          <w:sz w:val="19"/>
+          <w:szCs w:val="19"/>
+        </w:rPr>
+        <w:t xml:space="preserve">Commerciële vergelijkingssite.</w:t>
       </w:r>
     </w:p>
     <w:p>
@@ -28349,7 +29490,7 @@
           <w:sz w:val="19"/>
           <w:szCs w:val="19"/>
         </w:rPr>
-        <w:t xml:space="preserve">Cijfer klopt met CBS.</w:t>
+        <w:t xml:space="preserve">Tarieven komen overeen met de Belastingdienst.</w:t>
       </w:r>
     </w:p>
     <w:p>
@@ -28376,14 +29517,14 @@
           <w:sz w:val="19"/>
           <w:szCs w:val="19"/>
         </w:rPr>
-        <w:t xml:space="preserve">★★★☆☆ </w:t>
-      </w:r>
-      <w:r>
-        <w:rPr>
-          <w:sz w:val="19"/>
-          <w:szCs w:val="19"/>
-        </w:rPr>
-        <w:t xml:space="preserve">Informeren én de sector promoten.</w:t>
+        <w:t xml:space="preserve">★★☆☆☆ </w:t>
+      </w:r>
+      <w:r>
+        <w:rPr>
+          <w:sz w:val="19"/>
+          <w:szCs w:val="19"/>
+        </w:rPr>
+        <w:t xml:space="preserve">Verdient aan overstappen.</w:t>
       </w:r>
     </w:p>
     <w:p>
@@ -28406,7 +29547,7 @@
           <w:sz w:val="19"/>
           <w:szCs w:val="19"/>
         </w:rPr>
-        <w:t xml:space="preserve">Bruikbaar; cijfer is CBS-gebaseerd.</w:t>
+        <w:t xml:space="preserve">Bruikbaar voor de uitleg; tarieven bij voorkeur bij de Belastingdienst controleren.</w:t>
       </w:r>
     </w:p>
     <w:p>
@@ -28414,7 +29555,7 @@
         <w:pStyle w:val="Heading3"/>
       </w:pPr>
       <w:r>
-        <w:t xml:space="preserve">Solar Magazine (2026a)</w:t>
+        <w:t xml:space="preserve">Solar Magazine (2025)</w:t>
       </w:r>
     </w:p>
     <w:p>
@@ -28428,7 +29569,7 @@
           <w:sz w:val="19"/>
           <w:szCs w:val="19"/>
         </w:rPr>
-        <w:t xml:space="preserve">Bron: Solar Magazine. (2026a). 75 procent meer uren met negatieve stroomprijzen, nieuw record Nederland en België. [vakmedium]</w:t>
+        <w:t xml:space="preserve">Bron: Solar Magazine. (2025). Zonnepanelen goed voor 20 procent van Nederlandse stroomproductie. [vakmedium]</w:t>
       </w:r>
     </w:p>
     <w:p>
@@ -28462,7 +29603,7 @@
           <w:sz w:val="19"/>
           <w:szCs w:val="19"/>
         </w:rPr>
-        <w:t xml:space="preserve">2026, over heel 2025.</w:t>
+        <w:t xml:space="preserve">2025, over 2024.</w:t>
       </w:r>
     </w:p>
     <w:p>
@@ -28489,14 +29630,14 @@
           <w:sz w:val="19"/>
           <w:szCs w:val="19"/>
         </w:rPr>
-        <w:t xml:space="preserve">★★★★★ </w:t>
-      </w:r>
-      <w:r>
-        <w:rPr>
-          <w:sz w:val="19"/>
-          <w:szCs w:val="19"/>
-        </w:rPr>
-        <w:t xml:space="preserve">Bevat de reeks negatieve prijsuren 2022-2025.</w:t>
+        <w:t xml:space="preserve">★★★★☆ </w:t>
+      </w:r>
+      <w:r>
+        <w:rPr>
+          <w:sz w:val="19"/>
+          <w:szCs w:val="19"/>
+        </w:rPr>
+        <w:t xml:space="preserve">Aandeel zonnestroom als oorzaak van overcapaciteit.</w:t>
       </w:r>
     </w:p>
     <w:p>
@@ -28530,7 +29671,7 @@
           <w:sz w:val="19"/>
           <w:szCs w:val="19"/>
         </w:rPr>
-        <w:t xml:space="preserve">Vakblad; gebaseerd op marktdata van de beurs.</w:t>
+        <w:t xml:space="preserve">Vakblad voor de zonne-energiesector; neemt CBS-cijfers over.</w:t>
       </w:r>
     </w:p>
     <w:p>
@@ -28564,7 +29705,7 @@
           <w:sz w:val="19"/>
           <w:szCs w:val="19"/>
         </w:rPr>
-        <w:t xml:space="preserve">Concrete uurcijfers, controleerbaar bij EPEX.</w:t>
+        <w:t xml:space="preserve">Cijfer klopt met CBS.</w:t>
       </w:r>
     </w:p>
     <w:p>
@@ -28621,7 +29762,7 @@
           <w:sz w:val="19"/>
           <w:szCs w:val="19"/>
         </w:rPr>
-        <w:t xml:space="preserve">Bruikbaar.</w:t>
+        <w:t xml:space="preserve">Bruikbaar; cijfer is CBS-gebaseerd.</w:t>
       </w:r>
     </w:p>
     <w:p>
@@ -28629,7 +29770,7 @@
         <w:pStyle w:val="Heading3"/>
       </w:pPr>
       <w:r>
-        <w:t xml:space="preserve">Solar Magazine (2026b)</w:t>
+        <w:t xml:space="preserve">Solar Magazine (2026a)</w:t>
       </w:r>
     </w:p>
     <w:p>
@@ -28643,7 +29784,7 @@
           <w:sz w:val="19"/>
           <w:szCs w:val="19"/>
         </w:rPr>
-        <w:t xml:space="preserve">Bron: Solar Magazine. (2026b). Enexis kondigt nieuwe netknelpunten aan op stroomnet Limburg en Drenthe. [vakmedium]</w:t>
+        <w:t xml:space="preserve">Bron: Solar Magazine. (2026a). 75 procent meer uren met negatieve stroomprijzen, nieuw record Nederland en België. [vakmedium]</w:t>
       </w:r>
     </w:p>
     <w:p>
@@ -28677,7 +29818,7 @@
           <w:sz w:val="19"/>
           <w:szCs w:val="19"/>
         </w:rPr>
-        <w:t xml:space="preserve">Maart 2026.</w:t>
+        <w:t xml:space="preserve">2026, over heel 2025.</w:t>
       </w:r>
     </w:p>
     <w:p>
@@ -28711,7 +29852,7 @@
           <w:sz w:val="19"/>
           <w:szCs w:val="19"/>
         </w:rPr>
-        <w:t xml:space="preserve">Beschrijft waar in het Enexis-gebied congestie speelt.</w:t>
+        <w:t xml:space="preserve">Bevat de reeks negatieve prijsuren 2022-2025.</w:t>
       </w:r>
     </w:p>
     <w:p>
@@ -28745,7 +29886,7 @@
           <w:sz w:val="19"/>
           <w:szCs w:val="19"/>
         </w:rPr>
-        <w:t xml:space="preserve">Vakblad dat de updates van Enexis overneemt.</w:t>
+        <w:t xml:space="preserve">Vakblad; gebaseerd op marktdata van de beurs.</w:t>
       </w:r>
     </w:p>
     <w:p>
@@ -28779,7 +29920,7 @@
           <w:sz w:val="19"/>
           <w:szCs w:val="19"/>
         </w:rPr>
-        <w:t xml:space="preserve">Komt overeen met de netcapaciteitsupdates van Enexis.</w:t>
+        <w:t xml:space="preserve">Concrete uurcijfers, controleerbaar bij EPEX.</w:t>
       </w:r>
     </w:p>
     <w:p>
@@ -28813,7 +29954,7 @@
           <w:sz w:val="19"/>
           <w:szCs w:val="19"/>
         </w:rPr>
-        <w:t xml:space="preserve">Informeren van de sector.</w:t>
+        <w:t xml:space="preserve">Informeren én de sector promoten.</w:t>
       </w:r>
     </w:p>
     <w:p>
@@ -28836,7 +29977,7 @@
           <w:sz w:val="19"/>
           <w:szCs w:val="19"/>
         </w:rPr>
-        <w:t xml:space="preserve">Bruikbaar; primaire bron zijn de updates van Enexis zelf.</w:t>
+        <w:t xml:space="preserve">Bruikbaar.</w:t>
       </w:r>
     </w:p>
     <w:p>
@@ -28844,7 +29985,7 @@
         <w:pStyle w:val="Heading3"/>
       </w:pPr>
       <w:r>
-        <w:t xml:space="preserve">Vattenfall (z.d.)</w:t>
+        <w:t xml:space="preserve">Solar Magazine (2026b)</w:t>
       </w:r>
     </w:p>
     <w:p>
@@ -28858,7 +29999,7 @@
           <w:sz w:val="19"/>
           <w:szCs w:val="19"/>
         </w:rPr>
-        <w:t xml:space="preserve">Bron: Vattenfall. (z.d.). Bijmengverplichting groen gas: de gevolgen. [kennisbank leverancier]</w:t>
+        <w:t xml:space="preserve">Bron: Solar Magazine. (2026b). Enexis kondigt nieuwe netknelpunten aan op stroomnet Limburg en Drenthe. [vakmedium]</w:t>
       </w:r>
     </w:p>
     <w:p>
@@ -28885,14 +30026,14 @@
           <w:sz w:val="19"/>
           <w:szCs w:val="19"/>
         </w:rPr>
-        <w:t xml:space="preserve">★★★★☆ </w:t>
-      </w:r>
-      <w:r>
-        <w:rPr>
-          <w:sz w:val="19"/>
-          <w:szCs w:val="19"/>
-        </w:rPr>
-        <w:t xml:space="preserve">Wordt bijgehouden; geen datum.</w:t>
+        <w:t xml:space="preserve">★★★★★ </w:t>
+      </w:r>
+      <w:r>
+        <w:rPr>
+          <w:sz w:val="19"/>
+          <w:szCs w:val="19"/>
+        </w:rPr>
+        <w:t xml:space="preserve">Maart 2026.</w:t>
       </w:r>
     </w:p>
     <w:p>
@@ -28919,14 +30060,14 @@
           <w:sz w:val="19"/>
           <w:szCs w:val="19"/>
         </w:rPr>
-        <w:t xml:space="preserve">★★★★☆ </w:t>
-      </w:r>
-      <w:r>
-        <w:rPr>
-          <w:sz w:val="19"/>
-          <w:szCs w:val="19"/>
-        </w:rPr>
-        <w:t xml:space="preserve">Tweede bron voor de bijmengverplichting.</w:t>
+        <w:t xml:space="preserve">★★★★★ </w:t>
+      </w:r>
+      <w:r>
+        <w:rPr>
+          <w:sz w:val="19"/>
+          <w:szCs w:val="19"/>
+        </w:rPr>
+        <w:t xml:space="preserve">Beschrijft waar in het Enexis-gebied congestie speelt.</w:t>
       </w:r>
     </w:p>
     <w:p>
@@ -28960,7 +30101,7 @@
           <w:sz w:val="19"/>
           <w:szCs w:val="19"/>
         </w:rPr>
-        <w:t xml:space="preserve">Leverancier die onder de regeling valt.</w:t>
+        <w:t xml:space="preserve">Vakblad dat de updates van Enexis overneemt.</w:t>
       </w:r>
     </w:p>
     <w:p>
@@ -28994,7 +30135,7 @@
           <w:sz w:val="19"/>
           <w:szCs w:val="19"/>
         </w:rPr>
-        <w:t xml:space="preserve">Komt overeen met Engie (2026).</w:t>
+        <w:t xml:space="preserve">Komt overeen met de netcapaciteitsupdates van Enexis.</w:t>
       </w:r>
     </w:p>
     <w:p>
@@ -29028,7 +30169,7 @@
           <w:sz w:val="19"/>
           <w:szCs w:val="19"/>
         </w:rPr>
-        <w:t xml:space="preserve">Zakelijke klanten informeren.</w:t>
+        <w:t xml:space="preserve">Informeren van de sector.</w:t>
       </w:r>
     </w:p>
     <w:p>
@@ -29051,7 +30192,7 @@
           <w:sz w:val="19"/>
           <w:szCs w:val="19"/>
         </w:rPr>
-        <w:t xml:space="preserve">Bruikbaar als controlebron.</w:t>
+        <w:t xml:space="preserve">Bruikbaar; primaire bron zijn de updates van Enexis zelf.</w:t>
       </w:r>
     </w:p>
     <w:p>
@@ -29059,7 +30200,7 @@
         <w:pStyle w:val="Heading3"/>
       </w:pPr>
       <w:r>
-        <w:t xml:space="preserve">Verordening (EU) 2016/679 (2016)</w:t>
+        <w:t xml:space="preserve">Vattenfall (z.d.)</w:t>
       </w:r>
     </w:p>
     <w:p>
@@ -29073,7 +30214,7 @@
           <w:sz w:val="19"/>
           <w:szCs w:val="19"/>
         </w:rPr>
-        <w:t xml:space="preserve">Bron: Verordening (EU) 2016/679 van het Europees Parlement en de Raad van 27 april 2016 betreffende de bescherming van natuurlijke personen in verband met de verwerking van persoonsgegevens (Algemene verordening gegevensbescherming). (2016). Publicatieblad van de Europese Unie, L 119. [wetgeving]</w:t>
+        <w:t xml:space="preserve">Bron: Vattenfall. (z.d.). Bijmengverplichting groen gas: de gevolgen. [kennisbank leverancier]</w:t>
       </w:r>
     </w:p>
     <w:p>
@@ -29100,14 +30241,14 @@
           <w:sz w:val="19"/>
           <w:szCs w:val="19"/>
         </w:rPr>
-        <w:t xml:space="preserve">★★★★★ </w:t>
-      </w:r>
-      <w:r>
-        <w:rPr>
-          <w:sz w:val="19"/>
-          <w:szCs w:val="19"/>
-        </w:rPr>
-        <w:t xml:space="preserve">Van kracht sinds 25 mei 2018 en ongewijzigd.</w:t>
+        <w:t xml:space="preserve">★★★★☆ </w:t>
+      </w:r>
+      <w:r>
+        <w:rPr>
+          <w:sz w:val="19"/>
+          <w:szCs w:val="19"/>
+        </w:rPr>
+        <w:t xml:space="preserve">Wordt bijgehouden; geen datum.</w:t>
       </w:r>
     </w:p>
     <w:p>
@@ -29134,14 +30275,14 @@
           <w:sz w:val="19"/>
           <w:szCs w:val="19"/>
         </w:rPr>
-        <w:t xml:space="preserve">★★★★★ </w:t>
-      </w:r>
-      <w:r>
-        <w:rPr>
-          <w:sz w:val="19"/>
-          <w:szCs w:val="19"/>
-        </w:rPr>
-        <w:t xml:space="preserve">De wet waarop de privacyvraag is gebaseerd.</w:t>
+        <w:t xml:space="preserve">★★★★☆ </w:t>
+      </w:r>
+      <w:r>
+        <w:rPr>
+          <w:sz w:val="19"/>
+          <w:szCs w:val="19"/>
+        </w:rPr>
+        <w:t xml:space="preserve">Tweede bron voor de bijmengverplichting.</w:t>
       </w:r>
     </w:p>
     <w:p>
@@ -29168,14 +30309,14 @@
           <w:sz w:val="19"/>
           <w:szCs w:val="19"/>
         </w:rPr>
-        <w:t xml:space="preserve">★★★★★ </w:t>
-      </w:r>
-      <w:r>
-        <w:rPr>
-          <w:sz w:val="19"/>
-          <w:szCs w:val="19"/>
-        </w:rPr>
-        <w:t xml:space="preserve">Europese wetgever.</w:t>
+        <w:t xml:space="preserve">★★★☆☆ </w:t>
+      </w:r>
+      <w:r>
+        <w:rPr>
+          <w:sz w:val="19"/>
+          <w:szCs w:val="19"/>
+        </w:rPr>
+        <w:t xml:space="preserve">Leverancier die onder de regeling valt.</w:t>
       </w:r>
     </w:p>
     <w:p>
@@ -29202,14 +30343,14 @@
           <w:sz w:val="19"/>
           <w:szCs w:val="19"/>
         </w:rPr>
-        <w:t xml:space="preserve">★★★★★ </w:t>
-      </w:r>
-      <w:r>
-        <w:rPr>
-          <w:sz w:val="19"/>
-          <w:szCs w:val="19"/>
-        </w:rPr>
-        <w:t xml:space="preserve">De wettekst zelf.</w:t>
+        <w:t xml:space="preserve">★★★★☆ </w:t>
+      </w:r>
+      <w:r>
+        <w:rPr>
+          <w:sz w:val="19"/>
+          <w:szCs w:val="19"/>
+        </w:rPr>
+        <w:t xml:space="preserve">Komt overeen met Engie (2026).</w:t>
       </w:r>
     </w:p>
     <w:p>
@@ -29236,14 +30377,14 @@
           <w:sz w:val="19"/>
           <w:szCs w:val="19"/>
         </w:rPr>
-        <w:t xml:space="preserve">★★★★★ </w:t>
-      </w:r>
-      <w:r>
-        <w:rPr>
-          <w:sz w:val="19"/>
-          <w:szCs w:val="19"/>
-        </w:rPr>
-        <w:t xml:space="preserve">Wetgeving.</w:t>
+        <w:t xml:space="preserve">★★★☆☆ </w:t>
+      </w:r>
+      <w:r>
+        <w:rPr>
+          <w:sz w:val="19"/>
+          <w:szCs w:val="19"/>
+        </w:rPr>
+        <w:t xml:space="preserve">Zakelijke klanten informeren.</w:t>
       </w:r>
     </w:p>
     <w:p>
@@ -29266,7 +30407,7 @@
           <w:sz w:val="19"/>
           <w:szCs w:val="19"/>
         </w:rPr>
-        <w:t xml:space="preserve">Primaire bron; hoogste betrouwbaarheid.</w:t>
+        <w:t xml:space="preserve">Bruikbaar als controlebron.</w:t>
       </w:r>
     </w:p>
     <w:p>
@@ -29274,7 +30415,7 @@
         <w:pStyle w:val="Heading3"/>
       </w:pPr>
       <w:r>
-        <w:t xml:space="preserve">WISE (z.d.)</w:t>
+        <w:t xml:space="preserve">Verordening (EU) 2016/679 (2016)</w:t>
       </w:r>
     </w:p>
     <w:p>
@@ -29288,7 +30429,7 @@
           <w:sz w:val="19"/>
           <w:szCs w:val="19"/>
         </w:rPr>
-        <w:t xml:space="preserve">Bron: WISE. (z.d.). Deel stroomleveranciers blijft 'greenwashen', politiek moet ingrijpen. [milieuorganisatie]</w:t>
+        <w:t xml:space="preserve">Bron: Verordening (EU) 2016/679 van het Europees Parlement en de Raad van 27 april 2016 betreffende de bescherming van natuurlijke personen in verband met de verwerking van persoonsgegevens (Algemene verordening gegevensbescherming). (2016). Publicatieblad van de Europese Unie, L 119. [wetgeving]</w:t>
       </w:r>
     </w:p>
     <w:p>
@@ -29315,14 +30456,14 @@
           <w:sz w:val="19"/>
           <w:szCs w:val="19"/>
         </w:rPr>
-        <w:t xml:space="preserve">★★★☆☆ </w:t>
-      </w:r>
-      <w:r>
-        <w:rPr>
-          <w:sz w:val="19"/>
-          <w:szCs w:val="19"/>
-        </w:rPr>
-        <w:t xml:space="preserve">Geen datum zichtbaar; de scores (Eneco 8,1, Essent 4,8, Vattenfall 4,3) komen uit een eerdere editie van de Stroomranking.</w:t>
+        <w:t xml:space="preserve">★★★★★ </w:t>
+      </w:r>
+      <w:r>
+        <w:rPr>
+          <w:sz w:val="19"/>
+          <w:szCs w:val="19"/>
+        </w:rPr>
+        <w:t xml:space="preserve">Van kracht sinds 25 mei 2018 en ongewijzigd.</w:t>
       </w:r>
     </w:p>
     <w:p>
@@ -29356,7 +30497,7 @@
           <w:sz w:val="19"/>
           <w:szCs w:val="19"/>
         </w:rPr>
-        <w:t xml:space="preserve">Bevat de scores die wij voor de drie leveranciers gebruiken.</w:t>
+        <w:t xml:space="preserve">De wet waarop de privacyvraag is gebaseerd.</w:t>
       </w:r>
     </w:p>
     <w:p>
@@ -29383,14 +30524,14 @@
           <w:sz w:val="19"/>
           <w:szCs w:val="19"/>
         </w:rPr>
-        <w:t xml:space="preserve">★★★★☆ </w:t>
-      </w:r>
-      <w:r>
-        <w:rPr>
-          <w:sz w:val="19"/>
-          <w:szCs w:val="19"/>
-        </w:rPr>
-        <w:t xml:space="preserve">Mede-uitvoerder van de Stroomranking.</w:t>
+        <w:t xml:space="preserve">★★★★★ </w:t>
+      </w:r>
+      <w:r>
+        <w:rPr>
+          <w:sz w:val="19"/>
+          <w:szCs w:val="19"/>
+        </w:rPr>
+        <w:t xml:space="preserve">Europese wetgever.</w:t>
       </w:r>
     </w:p>
     <w:p>
@@ -29417,14 +30558,14 @@
           <w:sz w:val="19"/>
           <w:szCs w:val="19"/>
         </w:rPr>
-        <w:t xml:space="preserve">★★★★☆ </w:t>
-      </w:r>
-      <w:r>
-        <w:rPr>
-          <w:sz w:val="19"/>
-          <w:szCs w:val="19"/>
-        </w:rPr>
-        <w:t xml:space="preserve">Scores volgens vaste methode.</w:t>
+        <w:t xml:space="preserve">★★★★★ </w:t>
+      </w:r>
+      <w:r>
+        <w:rPr>
+          <w:sz w:val="19"/>
+          <w:szCs w:val="19"/>
+        </w:rPr>
+        <w:t xml:space="preserve">De wettekst zelf.</w:t>
       </w:r>
     </w:p>
     <w:p>
@@ -29451,6 +30592,85 @@
           <w:sz w:val="19"/>
           <w:szCs w:val="19"/>
         </w:rPr>
+        <w:t xml:space="preserve">★★★★★ </w:t>
+      </w:r>
+      <w:r>
+        <w:rPr>
+          <w:sz w:val="19"/>
+          <w:szCs w:val="19"/>
+        </w:rPr>
+        <w:t xml:space="preserve">Wetgeving.</w:t>
+      </w:r>
+    </w:p>
+    <w:p>
+      <w:pPr>
+        <w:spacing w:after="160" w:before="40"/>
+      </w:pPr>
+      <w:r>
+        <w:rPr>
+          <w:b/>
+          <w:bCs/>
+          <w:sz w:val="19"/>
+          <w:szCs w:val="19"/>
+        </w:rPr>
+        <w:t xml:space="preserve">Conclusie: </w:t>
+      </w:r>
+      <w:r>
+        <w:rPr>
+          <w:b/>
+          <w:bCs/>
+          <w:sz w:val="19"/>
+          <w:szCs w:val="19"/>
+        </w:rPr>
+        <w:t xml:space="preserve">Primaire bron; hoogste betrouwbaarheid.</w:t>
+      </w:r>
+    </w:p>
+    <w:p>
+      <w:pPr>
+        <w:pStyle w:val="Heading3"/>
+      </w:pPr>
+      <w:r>
+        <w:t xml:space="preserve">WISE (z.d.)</w:t>
+      </w:r>
+    </w:p>
+    <w:p>
+      <w:pPr>
+        <w:spacing w:after="80"/>
+      </w:pPr>
+      <w:r>
+        <w:rPr>
+          <w:i/>
+          <w:iCs/>
+          <w:sz w:val="19"/>
+          <w:szCs w:val="19"/>
+        </w:rPr>
+        <w:t xml:space="preserve">Bron: WISE. (z.d.). Deel stroomleveranciers blijft 'greenwashen', politiek moet ingrijpen. [milieuorganisatie]</w:t>
+      </w:r>
+    </w:p>
+    <w:p>
+      <w:pPr>
+        <w:pStyle w:val="ListParagraph"/>
+        <w:numPr>
+          <w:ilvl w:val="0"/>
+          <w:numId w:val="4"/>
+        </w:numPr>
+        <w:spacing w:after="40"/>
+      </w:pPr>
+      <w:r>
+        <w:rPr>
+          <w:b/>
+          <w:bCs/>
+          <w:sz w:val="19"/>
+          <w:szCs w:val="19"/>
+        </w:rPr>
+        <w:t xml:space="preserve">C - Currency: </w:t>
+      </w:r>
+      <w:r>
+        <w:rPr>
+          <w:rFonts w:ascii="Segoe UI Symbol" w:cs="Segoe UI Symbol" w:eastAsia="Segoe UI Symbol" w:hAnsi="Segoe UI Symbol"/>
+          <w:sz w:val="19"/>
+          <w:szCs w:val="19"/>
+        </w:rPr>
         <w:t xml:space="preserve">★★★☆☆ </w:t>
       </w:r>
       <w:r>
@@ -29458,6 +30678,142 @@
           <w:sz w:val="19"/>
           <w:szCs w:val="19"/>
         </w:rPr>
+        <w:t xml:space="preserve">Geen datum zichtbaar; de scores (Eneco 8,1, Essent 4,8, Vattenfall 4,3) komen uit een eerdere editie van de Stroomranking.</w:t>
+      </w:r>
+    </w:p>
+    <w:p>
+      <w:pPr>
+        <w:pStyle w:val="ListParagraph"/>
+        <w:numPr>
+          <w:ilvl w:val="0"/>
+          <w:numId w:val="4"/>
+        </w:numPr>
+        <w:spacing w:after="40"/>
+      </w:pPr>
+      <w:r>
+        <w:rPr>
+          <w:b/>
+          <w:bCs/>
+          <w:sz w:val="19"/>
+          <w:szCs w:val="19"/>
+        </w:rPr>
+        <w:t xml:space="preserve">R - Relevance: </w:t>
+      </w:r>
+      <w:r>
+        <w:rPr>
+          <w:rFonts w:ascii="Segoe UI Symbol" w:cs="Segoe UI Symbol" w:eastAsia="Segoe UI Symbol" w:hAnsi="Segoe UI Symbol"/>
+          <w:sz w:val="19"/>
+          <w:szCs w:val="19"/>
+        </w:rPr>
+        <w:t xml:space="preserve">★★★★★ </w:t>
+      </w:r>
+      <w:r>
+        <w:rPr>
+          <w:sz w:val="19"/>
+          <w:szCs w:val="19"/>
+        </w:rPr>
+        <w:t xml:space="preserve">Bevat de scores die wij voor de drie leveranciers gebruiken.</w:t>
+      </w:r>
+    </w:p>
+    <w:p>
+      <w:pPr>
+        <w:pStyle w:val="ListParagraph"/>
+        <w:numPr>
+          <w:ilvl w:val="0"/>
+          <w:numId w:val="4"/>
+        </w:numPr>
+        <w:spacing w:after="40"/>
+      </w:pPr>
+      <w:r>
+        <w:rPr>
+          <w:b/>
+          <w:bCs/>
+          <w:sz w:val="19"/>
+          <w:szCs w:val="19"/>
+        </w:rPr>
+        <w:t xml:space="preserve">A - Authority: </w:t>
+      </w:r>
+      <w:r>
+        <w:rPr>
+          <w:rFonts w:ascii="Segoe UI Symbol" w:cs="Segoe UI Symbol" w:eastAsia="Segoe UI Symbol" w:hAnsi="Segoe UI Symbol"/>
+          <w:sz w:val="19"/>
+          <w:szCs w:val="19"/>
+        </w:rPr>
+        <w:t xml:space="preserve">★★★★☆ </w:t>
+      </w:r>
+      <w:r>
+        <w:rPr>
+          <w:sz w:val="19"/>
+          <w:szCs w:val="19"/>
+        </w:rPr>
+        <w:t xml:space="preserve">Mede-uitvoerder van de Stroomranking.</w:t>
+      </w:r>
+    </w:p>
+    <w:p>
+      <w:pPr>
+        <w:pStyle w:val="ListParagraph"/>
+        <w:numPr>
+          <w:ilvl w:val="0"/>
+          <w:numId w:val="4"/>
+        </w:numPr>
+        <w:spacing w:after="40"/>
+      </w:pPr>
+      <w:r>
+        <w:rPr>
+          <w:b/>
+          <w:bCs/>
+          <w:sz w:val="19"/>
+          <w:szCs w:val="19"/>
+        </w:rPr>
+        <w:t xml:space="preserve">A - Accuracy: </w:t>
+      </w:r>
+      <w:r>
+        <w:rPr>
+          <w:rFonts w:ascii="Segoe UI Symbol" w:cs="Segoe UI Symbol" w:eastAsia="Segoe UI Symbol" w:hAnsi="Segoe UI Symbol"/>
+          <w:sz w:val="19"/>
+          <w:szCs w:val="19"/>
+        </w:rPr>
+        <w:t xml:space="preserve">★★★★☆ </w:t>
+      </w:r>
+      <w:r>
+        <w:rPr>
+          <w:sz w:val="19"/>
+          <w:szCs w:val="19"/>
+        </w:rPr>
+        <w:t xml:space="preserve">Scores volgens vaste methode.</w:t>
+      </w:r>
+    </w:p>
+    <w:p>
+      <w:pPr>
+        <w:pStyle w:val="ListParagraph"/>
+        <w:numPr>
+          <w:ilvl w:val="0"/>
+          <w:numId w:val="4"/>
+        </w:numPr>
+        <w:spacing w:after="40"/>
+      </w:pPr>
+      <w:r>
+        <w:rPr>
+          <w:b/>
+          <w:bCs/>
+          <w:sz w:val="19"/>
+          <w:szCs w:val="19"/>
+        </w:rPr>
+        <w:t xml:space="preserve">P - Purpose: </w:t>
+      </w:r>
+      <w:r>
+        <w:rPr>
+          <w:rFonts w:ascii="Segoe UI Symbol" w:cs="Segoe UI Symbol" w:eastAsia="Segoe UI Symbol" w:hAnsi="Segoe UI Symbol"/>
+          <w:sz w:val="19"/>
+          <w:szCs w:val="19"/>
+        </w:rPr>
+        <w:t xml:space="preserve">★★★☆☆ </w:t>
+      </w:r>
+      <w:r>
+        <w:rPr>
+          <w:sz w:val="19"/>
+          <w:szCs w:val="19"/>
+        </w:rPr>
         <w:t xml:space="preserve">Milieuorganisatie met een duidelijk standpunt (anti-greenwashing).</w:t>
       </w:r>
     </w:p>
@@ -29494,7 +30850,7 @@
     </w:p>
     <w:p>
       <w:r>
-        <w:t xml:space="preserve">De 43 bronnen in dit rapport verschillen sterk in betrouwbaarheid, en we hebben ze daarom ook verschillend gebruikt. De </w:t>
+        <w:t xml:space="preserve">De 44 bronnen in dit rapport verschillen sterk in betrouwbaarheid, en we hebben ze daarom ook verschillend gebruikt. De </w:t>
       </w:r>
       <w:r>
         <w:rPr>

</xml_diff>

<commit_message>
Sprint 2 documents: fill in student number, looser writing tone
Co-Authored-By: Claude Fable 5.1 <noreply@anthropic.com>
Claude-Session: https://claude.ai/code/session_01G4Ddwh7uTVc2EA5q2vaUJ2
</commit_message>
<xml_diff>
--- a/datalab-sprint2/Datalab1_Sprint2_Rapport_Energiemarkt_Enexis.docx
+++ b/datalab-sprint2/Datalab1_Sprint2_Rapport_Energiemarkt_Enexis.docx
@@ -121,7 +121,7 @@
           <w:sz w:val="22"/>
           <w:szCs w:val="22"/>
         </w:rPr>
-        <w:t xml:space="preserve">Joshua Ferreira ([studentnummer])</w:t>
+        <w:t xml:space="preserve">Joshua Ferreira (26108569)</w:t>
       </w:r>
     </w:p>
     <w:p>
@@ -696,7 +696,7 @@
     </w:p>
     <w:p>
       <w:r>
-        <w:t xml:space="preserve">In sprint 1 speelden wij de directie van Enexis Netbeheer en formuleerden we een datavraagstuk voor een data-consultant. In sprint 2 draaien de rollen om: nu zijn wij zelf de consultant. Om een goed datavraagstuk voor Enexis te kunnen oplossen, moeten we eerst de context begrijpen waarin Enexis werkt. Dit is stap 1 van de data science life-cycle: </w:t>
+        <w:t xml:space="preserve">In sprint 1 waren wij de directie van Enexis Netbeheer en bedachten we een datavraagstuk voor een data-consultant. In sprint 2 is het andersom: nu zijn wij zelf die consultant. Voordat we iets met de data van Enexis kunnen, moeten we eerst snappen in wat voor wereld Enexis werkt. Dat is stap 1 van de data science life-cycle: </w:t>
       </w:r>
       <w:r>
         <w:rPr>
@@ -706,7 +706,7 @@
         <w:t xml:space="preserve">business understanding</w:t>
       </w:r>
       <w:r>
-        <w:t xml:space="preserve">. Zonder domeinkennis kun je niet beoordelen of een uitkomst logisch is, net zoals je alleen met kennis van gezondheid weet dat een hartslag van 2000 slagen per minuut niet kan kloppen.</w:t>
+        <w:t xml:space="preserve">. Zonder die kennis zie je niet of een uitkomst klopt. Vergelijk het met een hartslag van 2000 slagen per minuut: alleen als je iets van gezondheid weet, zie je meteen dat dat niet kan.</w:t>
       </w:r>
     </w:p>
     <w:p>
@@ -808,7 +808,7 @@
         <w:t xml:space="preserve">Aanpak.</w:t>
       </w:r>
       <w:r>
-        <w:t xml:space="preserve"> We hebben de vaardigheden uit de workshop informatievaardigheden toegepast. We zochten met gerichte zoektermen naar primaire bronnen (CBS, ACM, Rijksoverheid, netbeheerders, leveranciers) en gebruikten nieuws- en sectorbronnen alleen als aanvulling. Alle bronnen zijn in de tekst en in de literatuurlijst vermeld volgens APA en beoordeeld met de CRAAP-methode (bijlage A). De prijsgrafiek is gemaakt in Python met matplotlib op basis van een CBS-dataset; de code staat in bijlage B. In bijlage C staat de ingevulde Checklist Rapporteren.</w:t>
+        <w:t xml:space="preserve"> We hebben de dingen uit de workshop informatievaardigheden echt gebruikt. We zochten met gerichte zoektermen eerst naar primaire bronnen (CBS, ACM, Rijksoverheid, netbeheerders, leveranciers) en pakten nieuws- en sectorbronnen alleen als aanvulling erbij. Alle bronnen zijn in de tekst en in de literatuurlijst vermeld volgens APA en beoordeeld met de CRAAP-methode (bijlage A). De prijsgrafiek is gemaakt in Python met matplotlib op basis van een CBS-dataset; de code staat in bijlage B. In bijlage C staat de ingevulde Checklist Rapporteren.</w:t>
       </w:r>
     </w:p>
     <w:p>
@@ -833,7 +833,7 @@
     </w:p>
     <w:p>
       <w:r>
-        <w:t xml:space="preserve">De Nederlandse energiemarkt is sinds de liberalisering gesplitst in twee soorten partijen. Netbeheerders zijn eigenaar van de kabels en leidingen en mogen geen energie verkopen. Leveranciers verkopen de energie en mogen geen netten bezitten. In dit hoofdstuk beschrijven we welke partijen er zijn en wat zij doen.</w:t>
+        <w:t xml:space="preserve">De Nederlandse energiemarkt is sinds de liberalisering in tweeën geknipt. Netbeheerders zijn van de kabels en leidingen en mogen geen energie verkopen. Leveranciers verkopen de energie en mogen geen netten hebben. In dit hoofdstuk kijken we welke partijen er zijn en wat ze precies doen.</w:t>
       </w:r>
     </w:p>
     <w:p>
@@ -846,7 +846,7 @@
     </w:p>
     <w:p>
       <w:r>
-        <w:t xml:space="preserve">Nederland heeft twee landelijke netbeheerders en zes regionale netbeheerders. TenneT beheert het landelijke hoogspanningsnet voor elektriciteit en Gasunie Transport Services (GTS) het landelijke gastransportnet. De regionale netbeheerders beheren de midden- en laagspanningsnetten en de regionale gasnetten en brengen de energie tot aan de meterkast (Energyzero, z.d.). Per gebied is er precies één regionale netbeheerder; een klant kan die dus niet kiezen.</w:t>
+        <w:t xml:space="preserve">Nederland heeft twee landelijke netbeheerders en zes regionale netbeheerders. TenneT beheert het landelijke hoogspanningsnet voor elektriciteit en Gasunie Transport Services (GTS) het landelijke gastransportnet. De regionale netbeheerders beheren de midden- en laagspanningsnetten en de regionale gasnetten en brengen de energie tot aan de meterkast (Energyzero, z.d.). Per gebied is er precies één regionale netbeheerder, dus als klant heb je daar niks te kiezen.</w:t>
       </w:r>
     </w:p>
     <w:tbl>
@@ -1659,7 +1659,7 @@
     </w:p>
     <w:p>
       <w:r>
-        <w:t xml:space="preserve">Een energieleverancier die gas of elektriciteit levert aan consumenten en andere kleinverbruikers heeft een vergunning van de Autoriteit Consument &amp; Markt (ACM) nodig (ACM, z.d.). In 2025 waren er 52 vergunninghouders voor elektriciteit en 50 voor gas; dat jaar zijn er geen vergunningen bijgekomen of ingetrokken (Overstappen.nl, 2025). Het aantal leveranciers is dus veel groter dan het aantal netbeheerders, en anders dan bij de netbeheerder kiest de klant zelf bij wie hij energie koopt.</w:t>
+        <w:t xml:space="preserve">Een energieleverancier die gas of elektriciteit levert aan consumenten en andere kleinverbruikers heeft een vergunning van de Autoriteit Consument &amp; Markt (ACM) nodig (ACM, z.d.). In 2025 waren er 52 vergunninghouders voor elektriciteit en 50 voor gas; dat jaar zijn er geen vergunningen bijgekomen of ingetrokken (Overstappen.nl, 2025). Er zijn dus veel meer leveranciers dan netbeheerders, en hier kies je als klant wél zelf bij wie je je energie koopt.</w:t>
       </w:r>
     </w:p>
     <w:p>
@@ -2377,12 +2377,12 @@
     </w:p>
     <w:p>
       <w:r>
-        <w:t xml:space="preserve">De netbeheerder zorgt voor het transport van energie. Hij legt kabels en leidingen aan, onderhoudt en vervangt ze, sluit nieuwe woningen en bedrijven aan, lost storingen op, beheert de slimme meters en verzwaart het net als de capaciteit niet meer voldoet. Omdat een netbeheerder een monopolie heeft in zijn gebied, zijn zijn taken wettelijk vastgelegd en houdt de ACM toezicht op de tarieven en de kwaliteit (Enexis Holding N.V., 2026).</w:t>
-      </w:r>
-    </w:p>
-    <w:p>
-      <w:r>
-        <w:t xml:space="preserve">De leverancier koopt energie in op de groothandelsmarkt (of produceert die zelf) en verkoopt die aan klanten. De leverancier bepaalt het leveringstarief, stuurt de energierekening, int ook de netbeheerkosten en belastingen namens de netbeheerder en de overheid, en regelt de klantenservice. De klant kiest zelf een leverancier en kan overstappen; de netbeheerder blijft dan dezelfde.</w:t>
+        <w:t xml:space="preserve">De netbeheerder regelt het transport. Hij legt kabels en leidingen aan, onderhoudt en vervangt ze, sluit nieuwe huizen en bedrijven aan, lost storingen op, beheert de slimme meters en verzwaart het net als het vol raakt. Omdat een netbeheerder in zijn gebied een monopolie heeft, staan zijn taken in de wet en kijkt de ACM mee naar de tarieven en de kwaliteit (Enexis Holding N.V., 2026).</w:t>
+      </w:r>
+    </w:p>
+    <w:p>
+      <w:r>
+        <w:t xml:space="preserve">De leverancier koopt energie in op de groothandelsmarkt (of maakt die zelf) en verkoopt die aan klanten. De leverancier bepaalt het leveringstarief, stuurt de energierekening, int daarbij ook de netbeheerkosten en de belastingen voor de netbeheerder en de overheid, en doet de klantenservice. Je kiest zelf je leverancier en kunt overstappen wanneer je wilt; je netbeheerder blijft dan gewoon dezelfde.</w:t>
       </w:r>
     </w:p>
     <w:tbl>
@@ -3012,7 +3012,7 @@
     </w:p>
     <w:p>
       <w:r>
-        <w:t xml:space="preserve">In dit hoofdstuk kijken we naar de prijs van energie en naar de capaciteit van het net. Eerst leggen we uit uit welke onderdelen de energierekening bestaat. Daarna laten we het verloop van de gas- en elektriciteitsprijs in 2022 zien en verklaren we de schommelingen. Tot slot beschrijven we de over- en ondercapaciteit op het elektriciteitsnet.</w:t>
+        <w:t xml:space="preserve">In dit hoofdstuk gaat het over de prijs van energie en over de ruimte op het net. Eerst leggen we uit waar de energierekening uit bestaat. Daarna laten we zien hoe de gas- en stroomprijs in 2022 per maand liep en waardoor dat kwam. Tot slot kijken we naar het volle net: waar is te weinig ruimte, waar juist te veel stroom, en wat doen netbeheerders en leveranciers daaraan.</w:t>
       </w:r>
     </w:p>
     <w:p>
@@ -3109,7 +3109,7 @@
         <w:spacing w:before="120"/>
       </w:pPr>
       <w:r>
-        <w:t xml:space="preserve">Grofweg gaat het geld dus naar drie partijen: de leverancier (levering), de netbeheerder (transport) en de overheid (energiebelasting en btw) (Selectra, z.d.). Bij gas is het aandeel van de belasting relatief groot; de overheid maakt gas daarmee bewust duurder dan elektriciteit om de overstap naar elektrisch verwarmen te stimuleren. Voor Enexis is alleen het tweede onderdeel relevant: de netbeheerkosten zijn de enige inkomsten van een netbeheerder.</w:t>
+        <w:t xml:space="preserve">Grofweg gaat je geld dus naar drie partijen: de leverancier (levering), de netbeheerder (transport) en de overheid (energiebelasting en btw) (Selectra, z.d.). Bij gas is het belastingdeel best groot; de overheid maakt gas expres duurder dan stroom, zodat mensen eerder elektrisch gaan verwarmen. Voor Enexis telt alleen het tweede deel: de netbeheerkosten zijn het enige waar een netbeheerder aan verdient.</w:t>
       </w:r>
     </w:p>
     <w:p>
@@ -3132,7 +3132,7 @@
         <w:t xml:space="preserve">Gemiddelde energietarieven voor consumenten, 2018-2023</w:t>
       </w:r>
       <w:r>
-        <w:t xml:space="preserve"> (StatLine-tabel 84672NED) van het CBS gebruikt. Deze tabel bevat per maand het gemiddelde variabele leveringstarief van nieuwe variabele contracten, inclusief btw (CBS, 2023a). We hebben de twaalf maandwaarden van 2022 overgenomen en in Python met matplotlib gevisualiseerd (figuur 1). Omdat gas in euro per m³ en elektriciteit in euro per kWh wordt gemeten, staan beide in een eigen paneel met een eigen as; een gedeelde as zou de twee reeksen niet eerlijk vergelijken. De code staat in bijlage B.</w:t>
+        <w:t xml:space="preserve"> (StatLine-tabel 84672NED) van het CBS gebruikt. Deze tabel bevat per maand het gemiddelde variabele leveringstarief van nieuwe variabele contracten, inclusief btw (CBS, 2023a). We hebben de twaalf maandwaarden van 2022 overgenomen en in Python met matplotlib in een grafiek gezet (figuur 1). Gas gaat per m³ en stroom per kWh, dus die staan elk in een eigen paneel met een eigen as; op één as zou je appels met peren vergelijken. De code staat in bijlage B.</w:t>
       </w:r>
     </w:p>
     <w:p>
@@ -4400,12 +4400,12 @@
         <w:t xml:space="preserve">Wat we zien.</w:t>
       </w:r>
       <w:r>
-        <w:t xml:space="preserve"> Gas en elektriciteit bewegen in 2022 vrijwel gelijk op. Beide beginnen het jaar al hoog, zakken in februari iets, schieten in maart omhoog, dalen weer tot juni en stijgen daarna naar een piek in september en oktober. Gas kost in oktober € 2,78 per m³, meer dan twee keer zoveel als in januari (€ 1,20). Elektriciteit stijgt van € 0,32 naar € 0,66 per kWh. In november en december dalen beide tarieven weer, maar ze blijven ver boven het niveau van begin 2022.</w:t>
-      </w:r>
-    </w:p>
-    <w:p>
-      <w:r>
-        <w:t xml:space="preserve">Dat elektriciteit dezelfde beweging maakt als gas is geen toeval. In Nederland bepalen gascentrales vaak de prijs op de elektriciteitsmarkt, omdat zij de laatste (duurste) centrale zijn die nodig is om aan de vraag te voldoen. Een dure gasprijs vertaalt zich daardoor bijna direct in een dure stroomprijs.</w:t>
+        <w:t xml:space="preserve"> Gas en stroom lopen in 2022 bijna precies gelijk op. Allebei beginnen ze het jaar al hoog, zakken in februari een beetje, schieten in maart omhoog, zakken weer tot juni en lopen daarna op naar een piek in september en oktober. Gas kost in oktober € 2,78 per m³, meer dan twee keer zoveel als in januari (€ 1,20). Elektriciteit stijgt van € 0,32 naar € 0,66 per kWh. In november en december dalen beide tarieven weer, maar ze blijven ver boven het niveau van begin 2022.</w:t>
+      </w:r>
+    </w:p>
+    <w:p>
+      <w:r>
+        <w:t xml:space="preserve">Dat stroom precies hetzelfde doet als gas is geen toeval. In Nederland bepalen gascentrales vaak de stroomprijs, omdat zij de laatste (en duurste) centrale zijn die aan moet om aan de vraag te voldoen. Wordt gas duur, dan wordt stroom dus bijna meteen ook duur.</w:t>
       </w:r>
     </w:p>
     <w:p>
@@ -4558,7 +4558,7 @@
         <w:spacing w:before="120"/>
       </w:pPr>
       <w:r>
-        <w:t xml:space="preserve">Samengevat: de prijs van gas werd in 2022 vooral bepaald door het aanbod van Russisch gas en de angst voor tekorten, en de stroomprijs volgde de gasprijs. De overheid heeft met de btw-verlaging, lagere energiebelasting, de korting van € 190 en het prijsplafond de gevolgen voor huishoudens gedempt, maar niet weggenomen.</w:t>
+        <w:t xml:space="preserve">Kort gezegd: de gasprijs van 2022 draaide om Russisch gas en de angst dat het op zou raken, en de stroomprijs ging daar gewoon in mee. De overheid heeft met de btw-verlaging, lagere energiebelasting, de € 190 korting en het prijsplafond de klap voor huishoudens kleiner gemaakt, maar niet weggehaald.</w:t>
       </w:r>
     </w:p>
     <w:p>
@@ -4571,7 +4571,7 @@
     </w:p>
     <w:p>
       <w:r>
-        <w:t xml:space="preserve">Productie en vraag naar energie lopen niet altijd gelijk op, en het elektriciteitsnet kan maar een beperkte hoeveelheid stroom tegelijk vervoeren. Dat leidt tot twee problemen die tegelijk bestaan: ondercapaciteit (netcongestie) en overcapaciteit (meer opwek dan vraag).</w:t>
+        <w:t xml:space="preserve">Hoeveel stroom er wordt gemaakt en hoeveel er wordt gebruikt loopt niet altijd gelijk, en een kabel kan maar een bepaalde hoeveelheid stroom tegelijk aan. Daardoor heb je twee problemen tegelijk: te weinig ruimte op het net (netcongestie) en te veel stroom op hetzelfde moment (overcapaciteit).</w:t>
       </w:r>
     </w:p>
     <w:p>
@@ -4584,7 +4584,7 @@
     </w:p>
     <w:p>
       <w:r>
-        <w:t xml:space="preserve">Door de energietransitie vragen bedrijven steeds zwaardere aansluitingen (warmtepompen, elektrische voertuigen, datacenters, elektrische ketels) en willen zonne- en windparken steeds meer stroom terugleveren. Het net groeit minder snel mee. Eind 2025 wachtten 15.014 bedrijven op een nieuwe of zwaardere aansluiting voor afname, samen goed voor 9.305 MW, en wachtten 8.687 bedrijven op capaciteit om terug te kunnen leveren, samen 5.027 MW. De wachtlijst voor afname groeide in een jaar met 26% (Duurzaam Ondernemen, 2026; Netbeheer Nederland, z.d.). Van de 580 voedingsgebieden waarin het net is opgedeeld, hebben er 314 een wachtrij voor afname en 70 een wachtrij voor teruglevering (Duurzaam Ondernemen, 2026).</w:t>
+        <w:t xml:space="preserve">Door de energietransitie willen bedrijven steeds zwaardere aansluitingen (warmtepompen, elektrische auto's, datacenters, elektrische ketels) en willen zonne- en windparken steeds meer stroom kwijt op het net. Het net groeit daar niet snel genoeg in mee. Eind 2025 wachtten 15.014 bedrijven op een nieuwe of zwaardere aansluiting voor afname, samen goed voor 9.305 MW, en wachtten 8.687 bedrijven op capaciteit om terug te kunnen leveren, samen 5.027 MW. De wachtlijst voor afname groeide in een jaar met 26% (Duurzaam Ondernemen, 2026; Netbeheer Nederland, z.d.). Van de 580 voedingsgebieden waarin het net is opgedeeld, hebben er 314 een wachtrij voor afname en 70 een wachtrij voor teruglevering (Duurzaam Ondernemen, 2026).</w:t>
       </w:r>
     </w:p>
     <w:p>
@@ -4609,7 +4609,7 @@
     </w:p>
     <w:p>
       <w:r>
-        <w:t xml:space="preserve">Het omgekeerde probleem is er ook. Op zonnige middagen produceren de zonnepanelen (goed voor ongeveer 20% van de Nederlandse stroomproductie in 2024; Solar Magazine, 2025) en de windparken samen meer dan er op dat moment wordt gebruikt. De marktprijs wordt dan negatief: producenten moeten betalen om stroom kwijt te kunnen. Nederland had 85 uren met negatieve stroomprijzen in 2022, 316 in 2023, 458 in 2024 en een record van 581 uren in 2025, ongeveer 7% van het jaar (Solar Magazine, 2026a). Op die momenten kan het overschot niet volledig naar het buitenland worden geëxporteerd en moeten opwekinstallaties worden teruggeschakeld. Deze overcapaciteit is dus geen kwestie van te veel kabels, maar van te veel opwek op hetzelfde moment, vooral in het voorjaar en de zomer tussen 11.00 en 16.00 uur.</w:t>
+        <w:t xml:space="preserve">Het omgekeerde probleem is er ook. Op zonnige middagen produceren de zonnepanelen (goed voor ongeveer 20% van de Nederlandse stroomproductie in 2024; Solar Magazine, 2025) en de windparken samen meer dan er op dat moment wordt gebruikt. De marktprijs wordt dan negatief: producenten moeten betalen om stroom kwijt te kunnen. Nederland had 85 uren met negatieve stroomprijzen in 2022, 316 in 2023, 458 in 2024 en een record van 581 uren in 2025, ongeveer 7% van het jaar (Solar Magazine, 2026a). Op die momenten kan het overschot niet volledig naar het buitenland worden geëxporteerd en moeten opwekinstallaties worden teruggeschakeld. Overcapaciteit betekent dus niet dat er te veel kabels liggen, maar dat er te veel stroom op hetzelfde moment wordt gemaakt, vooral in het voorjaar en de zomer tussen 11.00 en 16.00 uur.</w:t>
       </w:r>
     </w:p>
     <w:p>
@@ -5331,7 +5331,7 @@
     </w:p>
     <w:p>
       <w:r>
-        <w:t xml:space="preserve">Voor Enexis betekent dit dat het probleem de komende jaren niet alleen met koper en staal wordt opgelost. Enexis zegt zelf dat ondanks de recordinvesteringen "wachtlijsten en volle stroomnetten voorlopig de realiteit blijven" en dat de toekomst om meer flexibele oplossingen vraagt (Enexis Groep, 2026). Data over wanneer en waar het net vol zit, is daarvoor de sleutel; daar komen we in hoofdstuk 5 op terug.</w:t>
+        <w:t xml:space="preserve">Voor Enexis betekent dit dat het probleem de komende jaren niet alleen met extra kabels wordt opgelost. Enexis zegt zelf dat ondanks de recordinvesteringen "wachtlijsten en volle stroomnetten voorlopig de realiteit blijven" en dat de toekomst om meer flexibele oplossingen vraagt (Enexis Groep, 2026). Data over wanneer en waar het net vol zit, is daarvoor de sleutel; daar komen we in hoofdstuk 5 op terug.</w:t>
       </w:r>
     </w:p>
     <w:p>
@@ -5344,7 +5344,7 @@
     </w:p>
     <w:p>
       <w:r>
-        <w:t xml:space="preserve">De energiemarkt verandert snel door de energietransitie. In dit hoofdstuk beschrijven we de belangrijkste duurzaamheidsontwikkelingen op het gebied van gas en elektriciteit, vergelijken we drie energieleveranciers op duurzaamheid en kijken we naar de doelstellingen en de stand van zaken van "Nederland van het gas af".</w:t>
+        <w:t xml:space="preserve">De energiemarkt verandert snel door de energietransitie. In dit hoofdstuk zetten we de belangrijkste duurzaamheidsontwikkelingen voor gas en stroom op een rij, vergelijken we drie leveranciers op hoe groen ze echt zijn en kijken we wat de plannen zijn voor "Nederland van het gas af" en hoe ver we daarmee zijn.</w:t>
       </w:r>
     </w:p>
     <w:p>
@@ -5365,7 +5365,7 @@
     </w:p>
     <w:p>
       <w:r>
-        <w:t xml:space="preserve">Het aandeel hernieuwbare energie in het totale energieverbruik steeg in 2024 naar 19,8%, tegen 17,4% in 2023. De grootste bron is biomassa (34%), gevolgd door windenergie (32%) en zonne-energie (22%). Bij elektriciteit gaat het nog sneller: in 2024 kwam 50% van het elektriciteitsverbruik uit hernieuwbare bronnen, tegen 46% een jaar eerder. De productie van windmolens steeg (gecorrigeerd voor de hoeveelheid wind) met 20%, vooral door nieuwe windparken op zee, en de productie van zonnestroom met 9% (CBS, 2025a). Voor netbeheerders betekent dit dat de stroom steeds vaker van veel kleine, weersafhankelijke bronnen komt in plaats van van een paar grote centrales.</w:t>
+        <w:t xml:space="preserve">Het aandeel hernieuwbare energie in het totale energieverbruik steeg in 2024 naar 19,8%, tegen 17,4% in 2023. De grootste bron is biomassa (34%), gevolgd door windenergie (32%) en zonne-energie (22%). Bij elektriciteit gaat het nog sneller: in 2024 kwam 50% van het elektriciteitsverbruik uit hernieuwbare bronnen, tegen 46% een jaar eerder. De productie van windmolens steeg (gecorrigeerd voor de hoeveelheid wind) met 20%, vooral door nieuwe windparken op zee, en de productie van zonnestroom met 9% (CBS, 2025a). Voor netbeheerders betekent dit dat de stroom steeds vaker van heel veel kleine bronnen komt die van het weer afhangen, in plaats van van een paar grote centrales.</w:t>
       </w:r>
     </w:p>
     <w:p>
@@ -5440,7 +5440,7 @@
     </w:p>
     <w:p>
       <w:r>
-        <w:t xml:space="preserve">Om leveranciers eerlijk te vergelijken hebben we gebruikgemaakt van onafhankelijk onderzoek. Consumentenbond, Natuur &amp; Milieu, WISE en Greenpeace beoordelen leveranciers jaarlijks op drie onderdelen: investeringen, inkoop en levering van stroom. Een leverancier die stroom inkoopt op de grijze markt en die alleen op papier vergroent met buitenlandse certificaten (Garanties van Oorsprong) scoort laag; een leverancier die zelf in Nederlandse wind- en zonneparken investeert scoort hoog (Greenpeace et al., 2022; WISE, z.d.). Daarnaast hebben we de stroometiketten 2025 en de analyse van Energievergelijk (2025) gebruikt. We hebben één slechte, één gemiddelde en één goede leverancier gekozen.</w:t>
+        <w:t xml:space="preserve">Om leveranciers eerlijk te vergelijken zijn we niet afgegaan op hun eigen reclame, maar op onafhankelijk onderzoek. Consumentenbond, Natuur &amp; Milieu, WISE en Greenpeace beoordelen leveranciers jaarlijks op drie onderdelen: investeringen, inkoop en levering van stroom. Een leverancier die stroom inkoopt op de grijze markt en die alleen op papier vergroent met buitenlandse certificaten (Garanties van Oorsprong) scoort laag; een leverancier die zelf in Nederlandse wind- en zonneparken investeert scoort hoog (Greenpeace et al., 2022; WISE, z.d.). Daarnaast hebben we de stroometiketten 2025 en de analyse van Energievergelijk (2025) gebruikt. We hebben er één slechte, één gemiddelde en één goede uitgepikt.</w:t>
       </w:r>
     </w:p>
     <w:p>
@@ -5453,7 +5453,7 @@
     </w:p>
     <w:p>
       <w:r>
-        <w:t xml:space="preserve">Essent is met 1,5 miljoen klanten de op één na grootste leverancier, maar scoort in de duurzaamheidsranking van Consumentenbond, Natuur &amp; Milieu en WISE een onvoldoende: een 4,8 (WISE, z.d.). In de Groene Stroom Ranglijst van Greenpeace presteert moederbedrijf RWE/Essent van alle bedrijven in Nederland het slechtst, met een 3, omdat het nog investeerde in kolencentrales en de bijstook van biomassa meerekende als groene energie (Greenpeace et al., 2022). Het stroometiket 2025 laat de kern van het probleem zien: de totale mix van Essent N.V. bestond in 2025 voor 12% uit aardgas, 54,5% uit 'vergroende' stroom uit het buitenland en maar 33,5% uit groene stroom uit Nederland (Essent, 2025). Consumenten krijgen op papier 100% groene stroom, maar dat komt grotendeels door buitenlandse certificaten. Essent is sinds de overname door E.ON wel bezig met verbetering, maar loopt duidelijk achter op de kleinere groene leveranciers.</w:t>
+        <w:t xml:space="preserve">Essent is met 1,5 miljoen klanten de op één na grootste leverancier, maar scoort in de duurzaamheidsranking van Consumentenbond, Natuur &amp; Milieu en WISE een onvoldoende: een 4,8 (WISE, z.d.). In de Groene Stroom Ranglijst van Greenpeace presteert moederbedrijf RWE/Essent van alle bedrijven in Nederland het slechtst, met een 3, omdat het nog investeerde in kolencentrales en de bijstook van biomassa meerekende als groene energie (Greenpeace et al., 2022). Het stroometiket 2025 laat de kern van het probleem zien: de totale mix van Essent N.V. bestond in 2025 voor 12% uit aardgas, 54,5% uit 'vergroende' stroom uit het buitenland en maar 33,5% uit groene stroom uit Nederland (Essent, 2025). Op papier krijg je als klant 100% groene stroom, maar dat komt grotendeels door buitenlandse certificaten. Essent is sinds de overname door E.ON wel aan het verbeteren, maar loopt duidelijk achter op de kleine groene leveranciers.</w:t>
       </w:r>
     </w:p>
     <w:p>
@@ -5466,7 +5466,7 @@
     </w:p>
     <w:p>
       <w:r>
-        <w:t xml:space="preserve">Eneco scoort in dezelfde ranking een 8,1; het was de eerste keer in zeven jaar dat één van de 'grote drie' zo hoog scoorde (WISE, z.d.). Volgens het stroometiket komt 97,5% van de stroom van Eneco uit Nederlandse bronnen (Energievergelijk, 2025). Eneco investeert zelf in wind- en zonneparken en in warmtenetten. Toch noemen we Eneco 'gemiddeld' en niet 'goed': uit onderzoek van klimaatstichting HIER blijkt dat 34% van de onderzochte groenestroomproducten niet van duurzame bronnen in Nederland komt maar wordt vergroend met buitenlandse certificaten, en daarbij gaat het onder meer om bepaalde producten van Eneco en Essent (BNNVARA, z.d.). Eneco is bovendien veel groter dan de koplopers, waardoor een deel van het aanbod nog op de grijze markt wordt ingekocht. Eneco doet het dus goed voor een grote leverancier, maar is niet de groenste keuze.</w:t>
+        <w:t xml:space="preserve">Eneco scoort in dezelfde ranking een 8,1; het was de eerste keer in zeven jaar dat één van de 'grote drie' zo hoog scoorde (WISE, z.d.). Volgens het stroometiket komt 97,5% van de stroom van Eneco uit Nederlandse bronnen (Energievergelijk, 2025). Eneco investeert zelf in wind- en zonneparken en in warmtenetten. Toch noemen we Eneco 'gemiddeld' en niet 'goed': uit onderzoek van klimaatstichting HIER blijkt dat 34% van de onderzochte groenestroomproducten niet van duurzame bronnen in Nederland komt maar wordt vergroend met buitenlandse certificaten, en daarbij gaat het onder meer om bepaalde producten van Eneco en Essent (BNNVARA, z.d.). Eneco is bovendien veel groter dan de koplopers, waardoor een deel van het aanbod nog op de grijze markt wordt ingekocht. Eneco doet het dus prima voor zo'n grote partij, maar het is niet de groenste keuze die je kunt maken.</w:t>
       </w:r>
     </w:p>
     <w:p>
@@ -5479,7 +5479,7 @@
     </w:p>
     <w:p>
       <w:r>
-        <w:t xml:space="preserve">Pure Energie uit Enschede scoort al negen jaar op rij een 10 en is daarmee de groenste leverancier van Nederland (Greenpeace et al., 2022; Pure Energie, z.d.-b). Het bedrijf levert uitsluitend stroom uit eigen windmolens en zonneparken in Nederland en investeert de winst in nieuwe parken. Er wordt dus geen grijze stroom ingekocht die achteraf wordt vergroend. Ook Energie VanOns en OM | Nieuwe Energie behalen een 10; Vandebron, Greenchoice en OM worden in de analyse van Energievergelijk (2025) genoemd als de drie meest duurzame leveranciers van 2025, omdat zij uitsluitend groene stroom van Nederlandse herkomst leveren en het gas compenseren of mengen met groen gas. Het nadeel van deze koplopers is hun omvang: samen hebben zij een klein marktaandeel, waardoor hun invloed op de totale Nederlandse stroommix beperkt is.</w:t>
+        <w:t xml:space="preserve">Pure Energie uit Enschede scoort al negen jaar op rij een 10 en is daarmee de groenste leverancier van Nederland (Greenpeace et al., 2022; Pure Energie, z.d.-b). Het bedrijf levert uitsluitend stroom uit eigen windmolens en zonneparken in Nederland en investeert de winst in nieuwe parken. Er wordt dus geen grijze stroom ingekocht die achteraf op papier groen wordt gemaakt. Ook Energie VanOns en OM | Nieuwe Energie behalen een 10; Vandebron, Greenchoice en OM worden in de analyse van Energievergelijk (2025) genoemd als de drie meest duurzame leveranciers van 2025, omdat zij uitsluitend groene stroom van Nederlandse herkomst leveren en het gas compenseren of mengen met groen gas. Het nadeel van deze koplopers is dat ze klein zijn: samen hebben ze maar een klein stukje van de markt, dus op de totale Nederlandse stroommix maken ze nog weinig verschil.</w:t>
       </w:r>
     </w:p>
     <w:tbl>
@@ -6286,7 +6286,7 @@
         <w:spacing w:before="120"/>
       </w:pPr>
       <w:r>
-        <w:t xml:space="preserve">Belangrijk is dat 'van het gas af' niet betekent dat het gasnet verdwijnt. De overheid wil het aardgasverbruik van woningen en gebouwen afbouwen; voor de industrie en voor piekmomenten blijft gas (steeds vaker groen gas of waterstof) voorlopig nodig.</w:t>
+        <w:t xml:space="preserve">Goed om te weten: 'van het gas af' betekent niet dat het gasnet verdwijnt. De overheid wil het aardgasverbruik van woningen en gebouwen afbouwen; voor de industrie en voor piekmomenten blijft gas (steeds vaker groen gas of waterstof) voorlopig nodig.</w:t>
       </w:r>
     </w:p>
     <w:p>
@@ -6899,10 +6899,10 @@
           <w:b/>
           <w:bCs/>
         </w:rPr>
-        <w:t xml:space="preserve">Conclusie: Nederland ligt ver achter op schema.</w:t>
-      </w:r>
-      <w:r>
-        <w:t xml:space="preserve"> Een groei van 8,7% naar 11,2% in twee jaar betekent ongeveer 1,25 procentpunt per jaar, en een groot deel daarvan is nieuwbouw. Om in 2030 1,5 miljoen bestaande woningen van het gas te halen, moeten tussen 2022 en 2030 gemiddeld ruim 187.000 woningen per jaar worden omgebouwd (eigen berekening: 1,5 miljoen gedeeld door acht jaar). Voor warmtenetten ligt het huidige tempo rond 20.000 nieuwe aansluitingen per jaar, terwijl dat tot 2030 naar 50.000 en daarna naar ruim 80.000 per jaar moet (PBL, 2024). Het PBL constateert dat de uitfasering van aardgas gepaard gaat met veel structurele knelpunten, zoals hoge kosten voor bewoners, personeelstekorten en de volle elektriciteitsnetten uit hoofdstuk 3 (PBL, 2024). De hoge gasprijzen van 2022 hebben de vraag naar warmtepompen en isolatie wel versneld. Het doel van 2050 is daardoor niet onmogelijk, maar het tussendoel van 2030 wordt in het huidige tempo niet gehaald.</w:t>
+        <w:t xml:space="preserve">Conclusie: Nederland loopt flink achter op schema.</w:t>
+      </w:r>
+      <w:r>
+        <w:t xml:space="preserve"> Van 8,7% naar 11,2% in twee jaar is ongeveer 1,25 procentpunt per jaar, en een groot deel daarvan is gewoon nieuwbouw. Om in 2030 1,5 miljoen bestaande woningen van het gas te halen, moeten tussen 2022 en 2030 gemiddeld ruim 187.000 woningen per jaar worden omgebouwd (eigen berekening: 1,5 miljoen gedeeld door acht jaar). Voor warmtenetten ligt het huidige tempo rond 20.000 nieuwe aansluitingen per jaar, terwijl dat tot 2030 naar 50.000 en daarna naar ruim 80.000 per jaar moet (PBL, 2024). Het PBL constateert dat de uitfasering van aardgas gepaard gaat met veel structurele knelpunten, zoals hoge kosten voor bewoners, personeelstekorten en de volle elektriciteitsnetten uit hoofdstuk 3 (PBL, 2024). De hoge gasprijzen van 2022 hebben de vraag naar warmtepompen en isolatie wel versneld. Het doel van 2050 is daardoor niet onmogelijk, maar het tussendoel van 2030 halen we in dit tempo niet.</w:t>
       </w:r>
     </w:p>
     <w:p>
@@ -6915,7 +6915,7 @@
     </w:p>
     <w:p>
       <w:r>
-        <w:t xml:space="preserve">In sprint 1 kozen wij Enexis Netbeheer, de regionale netbeheerder van Groningen, Drenthe, Overijssel, Noord-Brabant en Limburg, met ongeveer 3 miljoen aansluitingen en 6.602 medewerkers (Enexis Holding N.V., 2026). In dit hoofdstuk passen we de resultaten van het onderzoek toe op Enexis: wat betekent de energiemarkt voor Enexis, wat kan Enexis doen op het gebied van duurzaamheid, hoe helpt data daarbij, welke privacy-incidenten zijn er in de sector geweest en welke vragen willen wij stellen aan de gastspreker.</w:t>
+        <w:t xml:space="preserve">In sprint 1 kozen wij Enexis Netbeheer, de regionale netbeheerder van Groningen, Drenthe, Overijssel, Noord-Brabant en Limburg, met ongeveer 3 miljoen aansluitingen en 6.602 medewerkers (Enexis Holding N.V., 2026). In dit hoofdstuk leggen we alles uit het onderzoek naast Enexis: wat betekent de energiemarkt voor Enexis, wat kan Enexis doen aan duurzaamheid, hoe helpt data daarbij, welke privacy-incidenten zijn er in de sector geweest en wat willen wij de gastspreker vragen.</w:t>
       </w:r>
     </w:p>
     <w:p>
@@ -7012,7 +7012,7 @@
     </w:p>
     <w:p>
       <w:r>
-        <w:t xml:space="preserve">Enexis produceert zelf geen energie en kan dus niet 'groener inkopen' zoals een leverancier. De duurzaamheidswinst van een netbeheerder zit in het mogelijk maken van de energietransitie: zo veel mogelijk zon, wind, warmtepompen en laadpalen aansluiten met zo min mogelijk nieuwe kabels. Ons advies bestaat uit vier onderdelen die logisch volgen uit hoofdstuk 3 en 4.</w:t>
+        <w:t xml:space="preserve">Enexis maakt zelf geen energie en kan dus niet 'groener inkopen' zoals een leverancier. Waar een netbeheerder wél het verschil maakt, is in het mogelijk maken van de energietransitie: zo veel mogelijk zon, wind, warmtepompen en laadpalen aansluiten met zo min mogelijk nieuwe kabels. Ons advies bestaat uit vier punten die rechtstreeks uit hoofdstuk 3 en 4 volgen.</w:t>
       </w:r>
     </w:p>
     <w:p>
@@ -7045,7 +7045,7 @@
         <w:t xml:space="preserve">loopt</w:t>
       </w:r>
       <w:r>
-        <w:t xml:space="preserve">. Dit sluit aan op onze hypothese uit sprint 1: postcodegebieden met bedrijfsterrein verbruiken het meest, woongebieden gemiddeld en natuurgebieden het minst. Door verbruiksgroei per soort gebied te modelleren kan Enexis investeringen plannen voordat de wachtlijst ontstaat, in plaats van erna.</w:t>
+        <w:t xml:space="preserve">. Dit sluit aan op onze hypothese uit sprint 1: postcodegebieden met bedrijfsterrein verbruiken het meest, woongebieden gemiddeld en natuurgebieden het minst. Als Enexis de groei van het verbruik per soort gebied modelleert, kan het investeringen plannen vóórdat er een wachtlijst ontstaat, in plaats van erna.</w:t>
       </w:r>
     </w:p>
     <w:p>
@@ -7058,7 +7058,7 @@
     </w:p>
     <w:p>
       <w:r>
-        <w:t xml:space="preserve">In 2025 speelde Enexis 542 MW aan flexibele capaciteit vrij (Enexis Groep, 2026). Dat kan meer. Met data over het verbruiksprofiel van elke grootverbruiker kan Enexis zelf uitrekenen welke bedrijven op de wachtlijst direct zouden kunnen worden aangesloten met een tijdsgebonden of capaciteitsbeperkend contract, en hen daarvoor gericht benaderen. Dat verkort de wachtlijst zonder extra kabels en voorkomt dat bedrijven zelf dieselgeneratoren plaatsen.</w:t>
+        <w:t xml:space="preserve">In 2025 speelde Enexis 542 MW aan flexibele capaciteit vrij (Enexis Groep, 2026). Dat kan meer. Met data over het verbruiksprofiel van elke grootverbruiker kan Enexis zelf uitrekenen welke bedrijven op de wachtlijst direct zouden kunnen worden aangesloten met een tijdsgebonden of capaciteitsbeperkend contract, en hen daarvoor gericht benaderen. Zo wordt de wachtlijst korter zonder één extra kabel, en voorkom je dat bedrijven uit wanhoop zelf dieselgeneratoren neerzetten.</w:t>
       </w:r>
     </w:p>
     <w:p>
@@ -7071,7 +7071,7 @@
     </w:p>
     <w:p>
       <w:r>
-        <w:t xml:space="preserve">Enexis verzwaart het elektriciteitsnet al wijk voor wijk met de Buurtaanpak (Enexis Groep, 2026). Dezelfde logica geldt voor gas. Door per postcodegebied het percentage woningen zonder gasaansluiting, het aandeel warmtepompen (uit de open data) en de Transitievisie Warmte van de gemeente te combineren, kan Enexis voorspellen in welke wijken het gasnet binnen tien jaar overbodig wordt. Daar hoeven oude leidingen niet meer te worden vervangen, en dat geld kan naar het elektriciteitsnet. Zo helpt data om niet te investeren in infrastructuur die straks wordt afgekoppeld.</w:t>
+        <w:t xml:space="preserve">Enexis verzwaart het elektriciteitsnet al wijk voor wijk met de Buurtaanpak (Enexis Groep, 2026). Dezelfde logica geldt voor gas. Door per postcodegebied het percentage woningen zonder gasaansluiting, het aandeel warmtepompen (uit de open data) en de Transitievisie Warmte van de gemeente te combineren, kan Enexis voorspellen in welke wijken het gasnet binnen tien jaar overbodig wordt. Daar hoeven oude leidingen niet meer te worden vervangen, en dat geld kan naar het elektriciteitsnet. Zo voorkomt data dat je geld steekt in leidingen die over een paar jaar toch worden afgekoppeld.</w:t>
       </w:r>
     </w:p>
     <w:p>
@@ -7084,7 +7084,7 @@
     </w:p>
     <w:p>
       <w:r>
-        <w:t xml:space="preserve">Het aantal uren met negatieve stroomprijzen verdubbelt bijna elke twee jaar (Solar Magazine, 2026a). Enexis kan per station meten op welke uren er te veel zon is en die data delen met bedrijven, zodat batterijen, laadpalen en elektrische boilers precies op die momenten worden ingeschakeld. Opslag bij zonneparken (cable pooling) en buurtbatterijen kunnen daardoor sneller een aansluiting krijgen. Dit maakt de stroom groener zonder dat er een kabel bij hoeft.</w:t>
+        <w:t xml:space="preserve">Het aantal uren met negatieve stroomprijzen verdubbelt bijna elke twee jaar (Solar Magazine, 2026a). Enexis kan per station meten op welke uren er te veel zon is en die data delen met bedrijven, zodat batterijen, laadpalen en elektrische boilers precies op die momenten worden ingeschakeld. Opslag bij zonneparken (cable pooling) en buurtbatterijen kunnen daardoor sneller een aansluiting krijgen. Zo wordt de stroom groener zonder dat er een kabel bij hoeft.</w:t>
       </w:r>
     </w:p>
     <w:p>
@@ -7688,7 +7688,7 @@
     </w:p>
     <w:p>
       <w:r>
-        <w:t xml:space="preserve">Alle vier de adviezen gebruiken data die Enexis al heeft (zie de activiteitentabel uit ons sprint 1-rapport). Het verschil zit in het gebruik: van terugkijken (waar zit het net vol?) naar vooruitkijken (waar loopt het net vol en wat doen we daaraan?). Dat is precies het datavraagstuk dat wij in sprint 1 formuleerden.</w:t>
+        <w:t xml:space="preserve">Alle vier de adviezen draaien op data die Enexis al heeft (zie de activiteitentabel uit ons sprint 1-rapport). Het verschil zit in wat je ermee doet: van terugkijken (waar zit het net vol?) naar vooruitkijken (waar loopt het net vol en wat doen we eraan?). Dat is precies het datavraagstuk dat wij in sprint 1 hebben opgeschreven.</w:t>
       </w:r>
     </w:p>
     <w:p>
@@ -7701,7 +7701,7 @@
     </w:p>
     <w:p>
       <w:r>
-        <w:t xml:space="preserve">We hebben eerst gezocht naar privacy-incidenten bij Enexis zelf, met zoektermen als "Enexis datalek", "Enexis Autoriteit Persoonsgegevens" en "Enexis slimme meter gegevens gelekt". We vonden geen gepubliceerd datalek of boete. Enexis heeft wel een procedure voor de meldplicht datalekken en een privacyverklaring, en legt op zijn website uit welke slimme-metergegevens het uitleest en waarvoor (Enexis Groep, z.d.; Enexis Netbeheer, z.d.). Omdat we geen incident bij Enexis konden vinden, hebben we volgens de opdracht andere organisaties in de Nederlandse energiesector gekozen. We beschrijven drie incidenten: twee bij Eneco, één van de drie grootste leveranciers, en één bij de kleinere leverancier Innova Energie. Samen laten ze drie verschillende oorzaken zien: een aanval van buitenaf, een lek bij een externe leverancier en een dader van binnenuit.</w:t>
+        <w:t xml:space="preserve">We hebben eerst gezocht naar privacy-incidenten bij Enexis zelf, met zoektermen als "Enexis datalek", "Enexis Autoriteit Persoonsgegevens" en "Enexis slimme meter gegevens gelekt". Daar kwam niks uit: geen gepubliceerd datalek en geen boete. Enexis heeft wel een procedure voor de meldplicht datalekken en een privacyverklaring, en legt op zijn website uit welke slimme-metergegevens het uitleest en waarvoor (Enexis Groep, z.d.; Enexis Netbeheer, z.d.). Omdat we geen incident bij Enexis konden vinden, hebben we volgens de opdracht andere organisaties in de Nederlandse energiesector gekozen. We beschrijven drie incidenten: twee bij Eneco, één van de drie grootste leveranciers, en één bij de kleinere leverancier Innova Energie. Samen laten ze drie verschillende oorzaken zien: een aanval van buitenaf, een lek bij een externe leverancier en een dader van binnenuit.</w:t>
       </w:r>
     </w:p>
     <w:p>
@@ -7724,7 +7724,7 @@
         <w:t xml:space="preserve">andere</w:t>
       </w:r>
       <w:r>
-        <w:t xml:space="preserve"> websites waren gestolen (credential stuffing). Omdat veel mensen hetzelfde wachtwoord hergebruiken, werkten die combinaties ook bij Eneco. In de accounts waren persoonsgegevens zoals naam, adres en bankrekeningnummer in te zien en mogelijk aan te passen. Eneco sloot Mijn Eneco tijdelijk af, informeerde de 1.700 getroffen klanten per e-mail, waarschuwde uit voorzorg nog 47.000 klanten die in dezelfde periode hadden ingelogd om hun wachtwoord te wijzigen, deed melding bij de Autoriteit Persoonsgegevens en deed aangifte bij de politie (Security.NL, 2021).</w:t>
+        <w:t xml:space="preserve"> websites waren gestolen (credential stuffing). Omdat veel mensen overal hetzelfde wachtwoord gebruiken, werkten die combinaties ook gewoon bij Eneco. In de accounts waren persoonsgegevens zoals naam, adres en bankrekeningnummer in te zien en mogelijk aan te passen. Eneco sloot Mijn Eneco tijdelijk af, informeerde de 1.700 getroffen klanten per e-mail, waarschuwde uit voorzorg nog 47.000 klanten die in dezelfde periode hadden ingelogd om hun wachtwoord te wijzigen, deed melding bij de Autoriteit Persoonsgegevens en deed aangifte bij de politie (Security.NL, 2021).</w:t>
       </w:r>
     </w:p>
     <w:p>
@@ -7737,7 +7737,7 @@
     </w:p>
     <w:p>
       <w:r>
-        <w:t xml:space="preserve">Tussen 5 en 17 mei 2024 werd AddComm, een bedrijf dat voor organisaties brieven en e-mails naar klanten verstuurt, getroffen door een ransomware-aanval waarbij ook klantgegevens werden gestolen. Eneco waarschuwde zijn klanten; ook Essent, Vattenfall, ABN AMRO, Bol.com, pensioenfondsen, waterbedrijven en gemeenten deden dat (NOS, 2024; Security.NL, 2024a, 2024b). Voor Eneco was niet precies duidelijk welke gegevens waren buitgemaakt; bij andere organisaties ging het om namen, adressen en klantnummers. Klanten werd gevraagd brieven en e-mails uit naam van Eneco extra goed te controleren en geen persoonlijke gegevens te delen, vanwege het risico op phishing. Dit incident laat zien dat een datalek bij een leverancier in de keten (een 'verwerker') een datalek van de energieleverancier zelf is.</w:t>
+        <w:t xml:space="preserve">Tussen 5 en 17 mei 2024 werd AddComm, een bedrijf dat voor organisaties brieven en e-mails naar klanten verstuurt, getroffen door een ransomware-aanval waarbij ook klantgegevens werden gestolen. Eneco waarschuwde zijn klanten; ook Essent, Vattenfall, ABN AMRO, Bol.com, pensioenfondsen, waterbedrijven en gemeenten deden dat (NOS, 2024; Security.NL, 2024a, 2024b). Voor Eneco was niet precies duidelijk welke gegevens waren buitgemaakt; bij andere organisaties ging het om namen, adressen en klantnummers. Klanten werd gevraagd brieven en e-mails uit naam van Eneco extra goed te controleren en geen persoonlijke gegevens te delen, vanwege het risico op phishing. Dit incident laat zien dat een lek bij een bedrijf dat je inhuurt (een 'verwerker') gewoon jouw lek is.</w:t>
       </w:r>
     </w:p>
     <w:p>
@@ -7750,7 +7750,7 @@
     </w:p>
     <w:p>
       <w:r>
-        <w:t xml:space="preserve">Op 19 maart 2026 waarschuwde energieleverancier Innova Energie zijn klanten voor een datalek dat niet door hackers, maar door een eigen medewerker was veroorzaakt. De medewerker had klantgegevens uit de systemen gehaald: voor- en achternaam, geboortedatum, telefoonnummer, e-mailadres, adresgegevens, bankrekeningnummer en de naam van de rekeninghouder. Hoeveel klanten het betrof, maakte het bedrijf niet bekend. Innova Energie heeft de medewerker ontslagen, aangifte gedaan bij het Openbaar Ministerie, het lek gemeld bij de Autoriteit Persoonsgegevens en de beveiliging aangescherpt (Security.NL, 2026). Het gevolg voor klanten is groot: met naam, geboortedatum en bankrekeningnummer kunnen criminelen identiteitsfraude plegen of overtuigende phishing-berichten sturen. Dit incident laat zien dat de grootste bedreiging soms van binnenuit komt en dat ook de eigen medewerkers alleen toegang mogen hebben tot de gegevens die zij voor hun werk nodig hebben.</w:t>
+        <w:t xml:space="preserve">Op 19 maart 2026 waarschuwde energieleverancier Innova Energie zijn klanten voor een datalek dat niet door hackers, maar door een eigen medewerker was veroorzaakt. De medewerker had klantgegevens uit de systemen gehaald: voor- en achternaam, geboortedatum, telefoonnummer, e-mailadres, adresgegevens, bankrekeningnummer en de naam van de rekeninghouder. Hoeveel klanten het betrof, maakte het bedrijf niet bekend. Innova Energie heeft de medewerker ontslagen, aangifte gedaan bij het Openbaar Ministerie, het lek gemeld bij de Autoriteit Persoonsgegevens en de beveiliging aangescherpt (Security.NL, 2026). Het gevolg voor klanten is groot: met naam, geboortedatum en bankrekeningnummer kunnen criminelen identiteitsfraude plegen of overtuigende phishing-berichten sturen. Dit incident laat zien dat het gevaar soms van binnenuit komt, en dat ook eigen medewerkers alleen bij de gegevens mogen die ze echt voor hun werk nodig hebben.</w:t>
       </w:r>
     </w:p>
     <w:tbl>
@@ -9466,7 +9466,7 @@
         <w:t xml:space="preserve">Wat Enexis hiervan kan leren.</w:t>
       </w:r>
       <w:r>
-        <w:t xml:space="preserve"> Voor een netbeheerder is de AVG minstens zo belangrijk als voor een leverancier. Enexis leest slimme meters uit en kan daarmee in principe zien wanneer iemand thuis is; daarom mag Enexis die gegevens alleen gebruiken voor wettelijke taken en moet de klant toestemming geven voor gedetailleerde uitlezing (Enexis Netbeheer, z.d.). In de open data per postcodegebied neemt Enexis daarom alleen rijen op met minimaal tien aansluitingen, zodat losse huishoudens niet herkenbaar zijn (zie ons sprint 1-rapport). Voor de adviezen in paragraaf 5.2 betekent dit dat de analyses met geaggregeerde of gepseudonimiseerde data moeten worden uitgevoerd, dat met externe partijen (bijvoorbeeld een data-consultant zoals wij) een verwerkersovereenkomst nodig is en dat een datalek binnen 72 uur bij de AP gemeld moet worden.</w:t>
+        <w:t xml:space="preserve"> Voor een netbeheerder is de AVG minstens zo belangrijk als voor een leverancier. Enexis leest slimme meters uit en kan daaraan in principe zien wanneer iemand thuis is; daarom mag Enexis die gegevens alleen gebruiken voor zijn wettelijke taken en moet de klant toestemming geven voordat de meter gedetailleerd wordt uitgelezen (Enexis Netbeheer, z.d.). In de open data per postcodegebied neemt Enexis daarom alleen rijen op met minimaal tien aansluitingen, zodat losse huishoudens niet herkenbaar zijn (zie ons sprint 1-rapport). Voor de adviezen in paragraaf 5.2 betekent dit dat de analyses met geaggregeerde of gepseudonimiseerde data moeten worden uitgevoerd, dat met externe partijen (bijvoorbeeld een data-consultant zoals wij) een verwerkersovereenkomst nodig is en dat een datalek binnen 72 uur bij de AP gemeld moet worden.</w:t>
       </w:r>
     </w:p>
     <w:p>
@@ -9479,7 +9479,7 @@
     </w:p>
     <w:p>
       <w:r>
-        <w:t xml:space="preserve">Op basis van dit onderzoek hebben we zes vragen voorbereid voor de gastspreker. Bij elke vraag staat waarom die relevant is voor onze opdracht.</w:t>
+        <w:t xml:space="preserve">Op basis van dit onderzoek hebben we zes vragen klaarstaan voor de gastspreker. Bij elke vraag staat waarom we die willen stellen.</w:t>
       </w:r>
     </w:p>
     <w:tbl>
@@ -10118,7 +10118,7 @@
     </w:p>
     <w:p>
       <w:r>
-        <w:t xml:space="preserve">De hoofdvraag van deze sprint was: "Onderzoek de Nederlandse energiemarkt". We beantwoorden die aan de hand van de deelvragen uit hoofdstuk 1.</w:t>
+        <w:t xml:space="preserve">De hoofdvraag van deze sprint was: "Onderzoek de Nederlandse energiemarkt". Hieronder beantwoorden we die per deelvraag uit hoofdstuk 1.</w:t>
       </w:r>
     </w:p>
     <w:p>
@@ -10130,7 +10130,7 @@
         <w:t xml:space="preserve">De markt is strak verdeeld in netbeheerders en leveranciers.</w:t>
       </w:r>
       <w:r>
-        <w:t xml:space="preserve"> Twee landelijke en zes regionale netbeheerders hebben een wettelijk monopolie op het transport en staan onder toezicht van de ACM; ongeveer vijftig leveranciers met een vergunning concurreren om de klant, waarbij Vattenfall, Essent en Eneco samen het grootste deel van de markt hebben. Enexis is als netbeheerder dus geen concurrent van de leveranciers, maar is wel afhankelijk van wat zij en hun klanten doen.</w:t>
+        <w:t xml:space="preserve"> Twee landelijke en zes regionale netbeheerders hebben een wettelijk monopolie op het transport en staan onder toezicht van de ACM; ongeveer vijftig leveranciers met een vergunning concurreren om de klant, waarbij Vattenfall, Essent en Eneco samen het grootste deel van de markt hebben. Enexis is als netbeheerder dus geen concurrent van de leveranciers, maar heeft wel last (of gemak) van wat zij en hun klanten doen.</w:t>
       </w:r>
     </w:p>
     <w:p>
@@ -10178,7 +10178,7 @@
         <w:t xml:space="preserve">Voor Enexis zit de duurzaamheidswinst in data.</w:t>
       </w:r>
       <w:r>
-        <w:t xml:space="preserve"> Enexis kan niet groener inkopen, maar kan de energietransitie wel versnellen door met slimme-meterdata, open data per postcode en de wachtlijst te voorspellen waar het net vol loopt, flexibiliteit actief aan te bieden, de afbouw van het gasnet wijk voor wijk te plannen en het middagoverschot te benutten. Alle benodigde data heeft Enexis al; de stap is van terugkijken naar vooruitkijken.</w:t>
+        <w:t xml:space="preserve"> Enexis kan niet groener inkopen, maar kan de energietransitie wel versnellen door met slimme-meterdata, open data per postcode en de wachtlijst te voorspellen waar het net vol loopt, flexibiliteit zelf aan te bieden, de afbouw van het gasnet wijk voor wijk te plannen en het middagoverschot te gebruiken. Alle data daarvoor heeft Enexis al in huis; de stap is van terugkijken naar vooruitkijken.</w:t>
       </w:r>
     </w:p>
     <w:p>
@@ -10190,7 +10190,7 @@
         <w:t xml:space="preserve">Privacy is daarbij geen bijzaak.</w:t>
       </w:r>
       <w:r>
-        <w:t xml:space="preserve"> De drie incidenten (credential stuffing bij Eneco in 2021, de ransomware-aanval bij verwerker AddComm in 2024 en de medewerker die bij Innova Energie klantgegevens stal in 2026) laten zien dat de AVG eist dat gegevens passend beveiligd zijn tegen aanvallen van buiten én van binnen (art. 32), dat een organisatie verantwoordelijk blijft voor haar verwerkers en medewerkers (art. 28 en 29) en dat een lek binnen 72 uur bij de AP wordt gemeld en betrokkenen worden geïnformeerd (art. 33 en 34). Voor het datavraagstuk van Enexis betekent dit dat analyses op geaggregeerde of gepseudonimiseerde data moeten worden uitgevoerd. Met deze domeinkennis kunnen wij in de volgende sprint de data van Enexis beoordelen op wat logisch is en wat niet, precies het doel van </w:t>
+        <w:t xml:space="preserve"> De drie incidenten (credential stuffing bij Eneco in 2021, de ransomware-aanval bij verwerker AddComm in 2024 en de medewerker die bij Innova Energie klantgegevens stal in 2026) laten zien dat de AVG eist dat gegevens passend beveiligd zijn tegen aanvallen van buiten én van binnen (art. 32), dat een organisatie verantwoordelijk blijft voor haar verwerkers en medewerkers (art. 28 en 29) en dat een lek binnen 72 uur bij de AP wordt gemeld en betrokkenen worden geïnformeerd (art. 33 en 34). Voor het datavraagstuk van Enexis betekent dit dat analyses op geaggregeerde of gepseudonimiseerde data moeten worden uitgevoerd. Met deze domeinkennis kunnen wij in de volgende sprint bij de data van Enexis zien wat logisch is en wat niet, en dat was precies het doel van </w:t>
       </w:r>
       <w:r>
         <w:rPr>

</xml_diff>